<commit_message>
Despues de presentar Entornos Tema3_Tarea3_LRP
</commit_message>
<xml_diff>
--- a/Tema3/Tema3_Tarea3_LRP.docx
+++ b/Tema3/Tema3_Tarea3_LRP.docx
@@ -406,7 +406,11 @@
             <w:rPr>
               <w:rFonts w:eastAsiaTheme="minorEastAsia"/>
               <w:noProof/>
+              <w:kern w:val="2"/>
+              <w:sz w:val="24"/>
+              <w:szCs w:val="24"/>
               <w:lang w:eastAsia="es-ES"/>
+              <w14:ligatures w14:val="standardContextual"/>
             </w:rPr>
           </w:pPr>
           <w:r>
@@ -418,13 +422,13 @@
           <w:r>
             <w:fldChar w:fldCharType="separate"/>
           </w:r>
-          <w:hyperlink w:anchor="_Toc220090425" w:history="1">
+          <w:hyperlink w:anchor="_Toc220698171" w:history="1">
             <w:r>
               <w:rPr>
                 <w:rStyle w:val="Hipervnculo"/>
                 <w:noProof/>
               </w:rPr>
-              <w:t>CAJA BLANCA</w:t>
+              <w:t>Junit</w:t>
             </w:r>
             <w:r>
               <w:rPr>
@@ -445,7 +449,7 @@
                 <w:noProof/>
                 <w:webHidden/>
               </w:rPr>
-              <w:instrText xml:space="preserve"> PAGEREF _Toc220090425 \h </w:instrText>
+              <w:instrText xml:space="preserve"> PAGEREF _Toc220698171 \h </w:instrText>
             </w:r>
             <w:r>
               <w:rPr>
@@ -485,16 +489,22 @@
             <w:rPr>
               <w:rFonts w:eastAsiaTheme="minorEastAsia"/>
               <w:noProof/>
+              <w:kern w:val="2"/>
+              <w:sz w:val="24"/>
+              <w:szCs w:val="24"/>
               <w:lang w:eastAsia="es-ES"/>
+              <w14:ligatures w14:val="standardContextual"/>
             </w:rPr>
           </w:pPr>
-          <w:hyperlink w:anchor="_Toc220090426" w:history="1">
+          <w:hyperlink w:anchor="_Toc220698172" w:history="1">
             <w:r>
               <w:rPr>
                 <w:rStyle w:val="Hipervnculo"/>
+                <w:rFonts w:eastAsia="Times New Roman"/>
                 <w:noProof/>
+                <w:lang w:eastAsia="es-ES"/>
               </w:rPr>
-              <w:t>CASOS DE PRUEBA</w:t>
+              <w:t>Escribe una batería de pruebas para el siguiente método de la clase Fecha que se expone a continuación. El método recibe un número entero y devuelve un String con un formato de fecha que dependerá del valor del número entero. Si el número recibido es diferente de 1, 2, y 3 se devolverá “ERROR”.</w:t>
             </w:r>
             <w:r>
               <w:rPr>
@@ -515,7 +525,7 @@
                 <w:noProof/>
                 <w:webHidden/>
               </w:rPr>
-              <w:instrText xml:space="preserve"> PAGEREF _Toc220090426 \h </w:instrText>
+              <w:instrText xml:space="preserve"> PAGEREF _Toc220698172 \h </w:instrText>
             </w:r>
             <w:r>
               <w:rPr>
@@ -555,16 +565,22 @@
             <w:rPr>
               <w:rFonts w:eastAsiaTheme="minorEastAsia"/>
               <w:noProof/>
+              <w:kern w:val="2"/>
+              <w:sz w:val="24"/>
+              <w:szCs w:val="24"/>
               <w:lang w:eastAsia="es-ES"/>
+              <w14:ligatures w14:val="standardContextual"/>
             </w:rPr>
           </w:pPr>
-          <w:hyperlink w:anchor="_Toc220090427" w:history="1">
+          <w:hyperlink w:anchor="_Toc220698173" w:history="1">
             <w:r>
               <w:rPr>
                 <w:rStyle w:val="Hipervnculo"/>
+                <w:rFonts w:eastAsia="Times New Roman"/>
                 <w:noProof/>
+                <w:lang w:eastAsia="es-ES"/>
               </w:rPr>
-              <w:t>GRAFO</w:t>
+              <w:t>Escribe una clase de pruebas para el método calculo de la calse Factorial. En el método se comprueba si el número es menor que 0, en este caso se lanza la excepción IllegalArgumentException con el mensaje “El numero no puede ser negativo o 0”. Si el valor del factorial calculado es menor que 0 es que ha ocurrido un error de desbordamiento, en este caso se lanza la excepción ArithmeticException y se lanza el mensaje “Overflow”. La clase a probar es la siguiente:</w:t>
             </w:r>
             <w:r>
               <w:rPr>
@@ -585,77 +601,7 @@
                 <w:noProof/>
                 <w:webHidden/>
               </w:rPr>
-              <w:instrText xml:space="preserve"> PAGEREF _Toc220090427 \h </w:instrText>
-            </w:r>
-            <w:r>
-              <w:rPr>
-                <w:noProof/>
-                <w:webHidden/>
-              </w:rPr>
-            </w:r>
-            <w:r>
-              <w:rPr>
-                <w:noProof/>
-                <w:webHidden/>
-              </w:rPr>
-              <w:fldChar w:fldCharType="separate"/>
-            </w:r>
-            <w:r>
-              <w:rPr>
-                <w:noProof/>
-                <w:webHidden/>
-              </w:rPr>
-              <w:t>4</w:t>
-            </w:r>
-            <w:r>
-              <w:rPr>
-                <w:noProof/>
-                <w:webHidden/>
-              </w:rPr>
-              <w:fldChar w:fldCharType="end"/>
-            </w:r>
-          </w:hyperlink>
-        </w:p>
-        <w:p>
-          <w:pPr>
-            <w:pStyle w:val="TDC2"/>
-            <w:tabs>
-              <w:tab w:val="right" w:leader="dot" w:pos="8494"/>
-            </w:tabs>
-            <w:rPr>
-              <w:rFonts w:eastAsiaTheme="minorEastAsia"/>
-              <w:noProof/>
-              <w:lang w:eastAsia="es-ES"/>
-            </w:rPr>
-          </w:pPr>
-          <w:hyperlink w:anchor="_Toc220090428" w:history="1">
-            <w:r>
-              <w:rPr>
-                <w:rStyle w:val="Hipervnculo"/>
-                <w:noProof/>
-              </w:rPr>
-              <w:t>CAMINOS INDEPENDIENTES</w:t>
-            </w:r>
-            <w:r>
-              <w:rPr>
-                <w:noProof/>
-                <w:webHidden/>
-              </w:rPr>
-              <w:tab/>
-            </w:r>
-            <w:r>
-              <w:rPr>
-                <w:noProof/>
-                <w:webHidden/>
-              </w:rPr>
-              <w:fldChar w:fldCharType="begin"/>
-            </w:r>
-            <w:r>
-              <w:rPr>
-                <w:noProof/>
-                <w:webHidden/>
-              </w:rPr>
-              <w:instrText xml:space="preserve"> PAGEREF _Toc220090428 \h </w:instrText>
+              <w:instrText xml:space="preserve"> PAGEREF _Toc220698173 \h </w:instrText>
             </w:r>
             <w:r>
               <w:rPr>
@@ -695,16 +641,22 @@
             <w:rPr>
               <w:rFonts w:eastAsiaTheme="minorEastAsia"/>
               <w:noProof/>
+              <w:kern w:val="2"/>
+              <w:sz w:val="24"/>
+              <w:szCs w:val="24"/>
               <w:lang w:eastAsia="es-ES"/>
+              <w14:ligatures w14:val="standardContextual"/>
             </w:rPr>
           </w:pPr>
-          <w:hyperlink w:anchor="_Toc220090429" w:history="1">
+          <w:hyperlink w:anchor="_Toc220698174" w:history="1">
             <w:r>
               <w:rPr>
                 <w:rStyle w:val="Hipervnculo"/>
+                <w:rFonts w:eastAsia="Times New Roman"/>
                 <w:noProof/>
+                <w:lang w:eastAsia="es-ES"/>
               </w:rPr>
-              <w:t>COMPLEJIDAD CICLOMATICA</w:t>
+              <w:t>Analiza el código de la siguiente clase y desarrolla una batería de pruebas en JUnit para cada uno de los métodos y constructores.</w:t>
             </w:r>
             <w:r>
               <w:rPr>
@@ -725,7 +677,7 @@
                 <w:noProof/>
                 <w:webHidden/>
               </w:rPr>
-              <w:instrText xml:space="preserve"> PAGEREF _Toc220090429 \h </w:instrText>
+              <w:instrText xml:space="preserve"> PAGEREF _Toc220698174 \h </w:instrText>
             </w:r>
             <w:r>
               <w:rPr>
@@ -745,7 +697,7 @@
                 <w:noProof/>
                 <w:webHidden/>
               </w:rPr>
-              <w:t>5</w:t>
+              <w:t>7</w:t>
             </w:r>
             <w:r>
               <w:rPr>
@@ -930,19 +882,33 @@
       <w:pPr>
         <w:pStyle w:val="Ttulo1"/>
       </w:pPr>
-      <w:r>
-        <w:lastRenderedPageBreak/>
+      <w:bookmarkStart w:id="0" w:name="_Toc220698171"/>
+      <w:r>
         <w:t>Junit</w:t>
       </w:r>
+      <w:bookmarkEnd w:id="0"/>
     </w:p>
     <w:p/>
     <w:p>
       <w:pPr>
-        <w:pStyle w:val="Prrafodelista"/>
-        <w:numPr>
-          <w:ilvl w:val="0"/>
-          <w:numId w:val="1"/>
-        </w:numPr>
+        <w:pStyle w:val="Ttulo2"/>
+        <w:rPr>
+          <w:rFonts w:eastAsia="Times New Roman"/>
+          <w:lang w:eastAsia="es-ES"/>
+        </w:rPr>
+      </w:pPr>
+      <w:bookmarkStart w:id="1" w:name="_Toc220698172"/>
+      <w:r>
+        <w:rPr>
+          <w:rFonts w:eastAsia="Times New Roman"/>
+          <w:lang w:eastAsia="es-ES"/>
+        </w:rPr>
+        <w:t>Escribe una batería de pruebas para el siguiente método de la clase Fecha que se expone a continuación. El método recibe un número entero y devuelve un String con un formato de fecha que dependerá del valor del número entero. Si el número recibido es diferente de 1, 2, y 3 se devolverá “ERROR”.</w:t>
+      </w:r>
+      <w:bookmarkEnd w:id="1"/>
+    </w:p>
+    <w:p>
+      <w:pPr>
         <w:spacing w:after="0" w:line="240" w:lineRule="auto"/>
         <w:rPr>
           <w:rFonts w:ascii="Verdana" w:eastAsia="Times New Roman" w:hAnsi="Verdana" w:cs="Tahoma"/>
@@ -952,7 +918,11 @@
           <w:lang w:eastAsia="es-ES"/>
         </w:rPr>
       </w:pPr>
-      <w:r>
+    </w:p>
+    <w:p>
+      <w:pPr>
+        <w:spacing w:after="0" w:line="240" w:lineRule="auto"/>
+        <w:ind w:left="360"/>
         <w:rPr>
           <w:rFonts w:ascii="Verdana" w:eastAsia="Times New Roman" w:hAnsi="Verdana" w:cs="Tahoma"/>
           <w:color w:val="2A2A2A"/>
@@ -960,7 +930,57 @@
           <w:szCs w:val="20"/>
           <w:lang w:eastAsia="es-ES"/>
         </w:rPr>
-        <w:t>Escribe una batería de pruebas para el siguiente método de la clase Fecha que se expone a continuación. El método recibe un número entero y devuelve un String con un formato de fecha que dependerá del valor del número entero. Si el número recibido es diferente de 1, 2, y 3 se devolverá “ERROR”.</w:t>
+      </w:pPr>
+      <w:r>
+        <w:rPr>
+          <w:rFonts w:ascii="Verdana" w:eastAsia="Times New Roman" w:hAnsi="Verdana" w:cs="Tahoma"/>
+          <w:noProof/>
+          <w:color w:val="2A2A2A"/>
+          <w:sz w:val="20"/>
+          <w:szCs w:val="20"/>
+          <w:lang w:eastAsia="es-ES"/>
+        </w:rPr>
+        <w:drawing>
+          <wp:inline distT="0" distB="0" distL="0" distR="0" wp14:anchorId="1B7524D8" wp14:editId="10555A79">
+            <wp:extent cx="5400040" cy="5086350"/>
+            <wp:effectExtent l="0" t="0" r="0" b="0"/>
+            <wp:docPr id="1799499103" name="Imagen 1"/>
+            <wp:cNvGraphicFramePr>
+              <a:graphicFrameLocks xmlns:a="http://schemas.openxmlformats.org/drawingml/2006/main" noChangeAspect="1"/>
+            </wp:cNvGraphicFramePr>
+            <a:graphic xmlns:a="http://schemas.openxmlformats.org/drawingml/2006/main">
+              <a:graphicData uri="http://schemas.openxmlformats.org/drawingml/2006/picture">
+                <pic:pic xmlns:pic="http://schemas.openxmlformats.org/drawingml/2006/picture">
+                  <pic:nvPicPr>
+                    <pic:cNvPr id="1799499103" name=""/>
+                    <pic:cNvPicPr/>
+                  </pic:nvPicPr>
+                  <pic:blipFill>
+                    <a:blip r:embed="rId12">
+                      <a:extLst>
+                        <a:ext uri="{28A0092B-C50C-407E-A947-70E740481C1C}">
+                          <a14:useLocalDpi xmlns:a14="http://schemas.microsoft.com/office/drawing/2010/main" val="0"/>
+                        </a:ext>
+                      </a:extLst>
+                    </a:blip>
+                    <a:stretch>
+                      <a:fillRect/>
+                    </a:stretch>
+                  </pic:blipFill>
+                  <pic:spPr>
+                    <a:xfrm>
+                      <a:off x="0" y="0"/>
+                      <a:ext cx="5400040" cy="5086350"/>
+                    </a:xfrm>
+                    <a:prstGeom prst="rect">
+                      <a:avLst/>
+                    </a:prstGeom>
+                  </pic:spPr>
+                </pic:pic>
+              </a:graphicData>
+            </a:graphic>
+          </wp:inline>
+        </w:drawing>
       </w:r>
     </w:p>
     <w:p>
@@ -978,6 +998,527 @@
     </w:p>
     <w:p>
       <w:pPr>
+        <w:spacing w:after="0" w:line="240" w:lineRule="auto"/>
+        <w:ind w:left="360"/>
+        <w:rPr>
+          <w:rFonts w:ascii="Verdana" w:eastAsia="Times New Roman" w:hAnsi="Verdana" w:cs="Tahoma"/>
+          <w:color w:val="2A2A2A"/>
+          <w:sz w:val="20"/>
+          <w:szCs w:val="20"/>
+          <w:lang w:eastAsia="es-ES"/>
+        </w:rPr>
+      </w:pPr>
+      <w:r>
+        <w:rPr>
+          <w:rFonts w:ascii="Verdana" w:eastAsia="Times New Roman" w:hAnsi="Verdana" w:cs="Tahoma"/>
+          <w:color w:val="2A2A2A"/>
+          <w:sz w:val="20"/>
+          <w:szCs w:val="20"/>
+          <w:lang w:eastAsia="es-ES"/>
+        </w:rPr>
+        <w:t>Creamos la clase FechaTest.java en la subcarpeta test.</w:t>
+      </w:r>
+    </w:p>
+    <w:p>
+      <w:pPr>
+        <w:spacing w:after="0" w:line="240" w:lineRule="auto"/>
+        <w:ind w:left="360"/>
+        <w:rPr>
+          <w:rFonts w:ascii="Verdana" w:eastAsia="Times New Roman" w:hAnsi="Verdana" w:cs="Tahoma"/>
+          <w:color w:val="2A2A2A"/>
+          <w:sz w:val="20"/>
+          <w:szCs w:val="20"/>
+          <w:lang w:eastAsia="es-ES"/>
+        </w:rPr>
+      </w:pPr>
+      <w:r>
+        <w:rPr>
+          <w:rFonts w:ascii="Verdana" w:eastAsia="Times New Roman" w:hAnsi="Verdana" w:cs="Tahoma"/>
+          <w:noProof/>
+          <w:color w:val="2A2A2A"/>
+          <w:sz w:val="20"/>
+          <w:szCs w:val="20"/>
+          <w:lang w:eastAsia="es-ES"/>
+        </w:rPr>
+        <w:lastRenderedPageBreak/>
+        <w:drawing>
+          <wp:inline distT="0" distB="0" distL="0" distR="0" wp14:anchorId="20A2D96B" wp14:editId="1C0ACB14">
+            <wp:extent cx="5400040" cy="7598410"/>
+            <wp:effectExtent l="0" t="0" r="0" b="2540"/>
+            <wp:docPr id="650177544" name="Imagen 4"/>
+            <wp:cNvGraphicFramePr>
+              <a:graphicFrameLocks xmlns:a="http://schemas.openxmlformats.org/drawingml/2006/main" noChangeAspect="1"/>
+            </wp:cNvGraphicFramePr>
+            <a:graphic xmlns:a="http://schemas.openxmlformats.org/drawingml/2006/main">
+              <a:graphicData uri="http://schemas.openxmlformats.org/drawingml/2006/picture">
+                <pic:pic xmlns:pic="http://schemas.openxmlformats.org/drawingml/2006/picture">
+                  <pic:nvPicPr>
+                    <pic:cNvPr id="650177544" name=""/>
+                    <pic:cNvPicPr/>
+                  </pic:nvPicPr>
+                  <pic:blipFill>
+                    <a:blip r:embed="rId13">
+                      <a:extLst>
+                        <a:ext uri="{28A0092B-C50C-407E-A947-70E740481C1C}">
+                          <a14:useLocalDpi xmlns:a14="http://schemas.microsoft.com/office/drawing/2010/main" val="0"/>
+                        </a:ext>
+                      </a:extLst>
+                    </a:blip>
+                    <a:stretch>
+                      <a:fillRect/>
+                    </a:stretch>
+                  </pic:blipFill>
+                  <pic:spPr>
+                    <a:xfrm>
+                      <a:off x="0" y="0"/>
+                      <a:ext cx="5400040" cy="7598410"/>
+                    </a:xfrm>
+                    <a:prstGeom prst="rect">
+                      <a:avLst/>
+                    </a:prstGeom>
+                  </pic:spPr>
+                </pic:pic>
+              </a:graphicData>
+            </a:graphic>
+          </wp:inline>
+        </w:drawing>
+      </w:r>
+    </w:p>
+    <w:p>
+      <w:pPr>
+        <w:spacing w:after="0" w:line="240" w:lineRule="auto"/>
+        <w:ind w:left="360"/>
+        <w:rPr>
+          <w:rFonts w:ascii="Verdana" w:eastAsia="Times New Roman" w:hAnsi="Verdana" w:cs="Tahoma"/>
+          <w:color w:val="2A2A2A"/>
+          <w:sz w:val="20"/>
+          <w:szCs w:val="20"/>
+          <w:lang w:eastAsia="es-ES"/>
+        </w:rPr>
+      </w:pPr>
+      <w:r>
+        <w:rPr>
+          <w:rFonts w:ascii="Verdana" w:eastAsia="Times New Roman" w:hAnsi="Verdana" w:cs="Tahoma"/>
+          <w:color w:val="2A2A2A"/>
+          <w:sz w:val="20"/>
+          <w:szCs w:val="20"/>
+          <w:lang w:eastAsia="es-ES"/>
+        </w:rPr>
+        <w:t>Hemos chequeado lo siguiente:</w:t>
+      </w:r>
+    </w:p>
+    <w:p>
+      <w:pPr>
+        <w:spacing w:after="0" w:line="240" w:lineRule="auto"/>
+        <w:ind w:left="360"/>
+        <w:rPr>
+          <w:rFonts w:ascii="Verdana" w:eastAsia="Times New Roman" w:hAnsi="Verdana" w:cs="Tahoma"/>
+          <w:color w:val="2A2A2A"/>
+          <w:sz w:val="20"/>
+          <w:szCs w:val="20"/>
+          <w:lang w:eastAsia="es-ES"/>
+        </w:rPr>
+      </w:pPr>
+      <w:r>
+        <w:rPr>
+          <w:rFonts w:ascii="Verdana" w:eastAsia="Times New Roman" w:hAnsi="Verdana" w:cs="Tahoma"/>
+          <w:color w:val="2A2A2A"/>
+          <w:sz w:val="20"/>
+          <w:szCs w:val="20"/>
+          <w:lang w:eastAsia="es-ES"/>
+        </w:rPr>
+        <w:t>De manera positiva (casos correctos)</w:t>
+      </w:r>
+    </w:p>
+    <w:p>
+      <w:pPr>
+        <w:spacing w:after="0" w:line="240" w:lineRule="auto"/>
+        <w:ind w:left="360"/>
+        <w:rPr>
+          <w:rFonts w:ascii="Verdana" w:eastAsia="Times New Roman" w:hAnsi="Verdana" w:cs="Tahoma"/>
+          <w:color w:val="2A2A2A"/>
+          <w:sz w:val="20"/>
+          <w:szCs w:val="20"/>
+          <w:lang w:eastAsia="es-ES"/>
+        </w:rPr>
+      </w:pPr>
+      <w:r>
+        <w:rPr>
+          <w:rFonts w:ascii="Verdana" w:eastAsia="Times New Roman" w:hAnsi="Verdana" w:cs="Tahoma"/>
+          <w:color w:val="2A2A2A"/>
+          <w:sz w:val="20"/>
+          <w:szCs w:val="20"/>
+          <w:lang w:eastAsia="es-ES"/>
+        </w:rPr>
+        <w:t xml:space="preserve">* </w:t>
+      </w:r>
+      <w:proofErr w:type="spellStart"/>
+      <w:proofErr w:type="gramStart"/>
+      <w:r>
+        <w:rPr>
+          <w:rFonts w:ascii="Verdana" w:eastAsia="Times New Roman" w:hAnsi="Verdana" w:cs="Tahoma"/>
+          <w:color w:val="2A2A2A"/>
+          <w:sz w:val="20"/>
+          <w:szCs w:val="20"/>
+          <w:lang w:eastAsia="es-ES"/>
+        </w:rPr>
+        <w:t>devuelveFecha</w:t>
+      </w:r>
+      <w:proofErr w:type="spellEnd"/>
+      <w:r>
+        <w:rPr>
+          <w:rFonts w:ascii="Verdana" w:eastAsia="Times New Roman" w:hAnsi="Verdana" w:cs="Tahoma"/>
+          <w:color w:val="2A2A2A"/>
+          <w:sz w:val="20"/>
+          <w:szCs w:val="20"/>
+          <w:lang w:eastAsia="es-ES"/>
+        </w:rPr>
+        <w:t>(</w:t>
+      </w:r>
+      <w:proofErr w:type="gramEnd"/>
+      <w:r>
+        <w:rPr>
+          <w:rFonts w:ascii="Verdana" w:eastAsia="Times New Roman" w:hAnsi="Verdana" w:cs="Tahoma"/>
+          <w:color w:val="2A2A2A"/>
+          <w:sz w:val="20"/>
+          <w:szCs w:val="20"/>
+          <w:lang w:eastAsia="es-ES"/>
+        </w:rPr>
+        <w:t xml:space="preserve">1) -&gt; se espera "2026/01" (formato </w:t>
+      </w:r>
+      <w:proofErr w:type="spellStart"/>
+      <w:r>
+        <w:rPr>
+          <w:rFonts w:ascii="Verdana" w:eastAsia="Times New Roman" w:hAnsi="Verdana" w:cs="Tahoma"/>
+          <w:color w:val="2A2A2A"/>
+          <w:sz w:val="20"/>
+          <w:szCs w:val="20"/>
+          <w:lang w:eastAsia="es-ES"/>
+        </w:rPr>
+        <w:t>yyyy</w:t>
+      </w:r>
+      <w:proofErr w:type="spellEnd"/>
+      <w:r>
+        <w:rPr>
+          <w:rFonts w:ascii="Verdana" w:eastAsia="Times New Roman" w:hAnsi="Verdana" w:cs="Tahoma"/>
+          <w:color w:val="2A2A2A"/>
+          <w:sz w:val="20"/>
+          <w:szCs w:val="20"/>
+          <w:lang w:eastAsia="es-ES"/>
+        </w:rPr>
+        <w:t>/MM) y longitud 7</w:t>
+      </w:r>
+    </w:p>
+    <w:p>
+      <w:pPr>
+        <w:spacing w:after="0" w:line="240" w:lineRule="auto"/>
+        <w:ind w:left="360"/>
+        <w:rPr>
+          <w:rFonts w:ascii="Verdana" w:eastAsia="Times New Roman" w:hAnsi="Verdana" w:cs="Tahoma"/>
+          <w:color w:val="2A2A2A"/>
+          <w:sz w:val="20"/>
+          <w:szCs w:val="20"/>
+          <w:lang w:eastAsia="es-ES"/>
+        </w:rPr>
+      </w:pPr>
+      <w:r>
+        <w:rPr>
+          <w:rFonts w:ascii="Verdana" w:eastAsia="Times New Roman" w:hAnsi="Verdana" w:cs="Tahoma"/>
+          <w:color w:val="2A2A2A"/>
+          <w:sz w:val="20"/>
+          <w:szCs w:val="20"/>
+          <w:lang w:eastAsia="es-ES"/>
+        </w:rPr>
+        <w:t xml:space="preserve">* </w:t>
+      </w:r>
+      <w:proofErr w:type="spellStart"/>
+      <w:proofErr w:type="gramStart"/>
+      <w:r>
+        <w:rPr>
+          <w:rFonts w:ascii="Verdana" w:eastAsia="Times New Roman" w:hAnsi="Verdana" w:cs="Tahoma"/>
+          <w:color w:val="2A2A2A"/>
+          <w:sz w:val="20"/>
+          <w:szCs w:val="20"/>
+          <w:lang w:eastAsia="es-ES"/>
+        </w:rPr>
+        <w:t>devuelveFecha</w:t>
+      </w:r>
+      <w:proofErr w:type="spellEnd"/>
+      <w:r>
+        <w:rPr>
+          <w:rFonts w:ascii="Verdana" w:eastAsia="Times New Roman" w:hAnsi="Verdana" w:cs="Tahoma"/>
+          <w:color w:val="2A2A2A"/>
+          <w:sz w:val="20"/>
+          <w:szCs w:val="20"/>
+          <w:lang w:eastAsia="es-ES"/>
+        </w:rPr>
+        <w:t>(</w:t>
+      </w:r>
+      <w:proofErr w:type="gramEnd"/>
+      <w:r>
+        <w:rPr>
+          <w:rFonts w:ascii="Verdana" w:eastAsia="Times New Roman" w:hAnsi="Verdana" w:cs="Tahoma"/>
+          <w:color w:val="2A2A2A"/>
+          <w:sz w:val="20"/>
+          <w:szCs w:val="20"/>
+          <w:lang w:eastAsia="es-ES"/>
+        </w:rPr>
+        <w:t>2) -&gt; se espera "01/2026" (formato MM/YYYY) y longitud 7</w:t>
+      </w:r>
+    </w:p>
+    <w:p>
+      <w:pPr>
+        <w:spacing w:after="0" w:line="240" w:lineRule="auto"/>
+        <w:ind w:left="360"/>
+        <w:rPr>
+          <w:rFonts w:ascii="Verdana" w:eastAsia="Times New Roman" w:hAnsi="Verdana" w:cs="Tahoma"/>
+          <w:color w:val="2A2A2A"/>
+          <w:sz w:val="20"/>
+          <w:szCs w:val="20"/>
+          <w:lang w:eastAsia="es-ES"/>
+        </w:rPr>
+      </w:pPr>
+      <w:r>
+        <w:rPr>
+          <w:rFonts w:ascii="Verdana" w:eastAsia="Times New Roman" w:hAnsi="Verdana" w:cs="Tahoma"/>
+          <w:color w:val="2A2A2A"/>
+          <w:sz w:val="20"/>
+          <w:szCs w:val="20"/>
+          <w:lang w:eastAsia="es-ES"/>
+        </w:rPr>
+        <w:t xml:space="preserve">* </w:t>
+      </w:r>
+      <w:proofErr w:type="spellStart"/>
+      <w:proofErr w:type="gramStart"/>
+      <w:r>
+        <w:rPr>
+          <w:rFonts w:ascii="Verdana" w:eastAsia="Times New Roman" w:hAnsi="Verdana" w:cs="Tahoma"/>
+          <w:color w:val="2A2A2A"/>
+          <w:sz w:val="20"/>
+          <w:szCs w:val="20"/>
+          <w:lang w:eastAsia="es-ES"/>
+        </w:rPr>
+        <w:t>devuelveFecha</w:t>
+      </w:r>
+      <w:proofErr w:type="spellEnd"/>
+      <w:r>
+        <w:rPr>
+          <w:rFonts w:ascii="Verdana" w:eastAsia="Times New Roman" w:hAnsi="Verdana" w:cs="Tahoma"/>
+          <w:color w:val="2A2A2A"/>
+          <w:sz w:val="20"/>
+          <w:szCs w:val="20"/>
+          <w:lang w:eastAsia="es-ES"/>
+        </w:rPr>
+        <w:t>(</w:t>
+      </w:r>
+      <w:proofErr w:type="gramEnd"/>
+      <w:r>
+        <w:rPr>
+          <w:rFonts w:ascii="Verdana" w:eastAsia="Times New Roman" w:hAnsi="Verdana" w:cs="Tahoma"/>
+          <w:color w:val="2A2A2A"/>
+          <w:sz w:val="20"/>
+          <w:szCs w:val="20"/>
+          <w:lang w:eastAsia="es-ES"/>
+        </w:rPr>
+        <w:t>3) -&gt; se espera "01/26" (formato MM/YY) y longitud 5</w:t>
+      </w:r>
+    </w:p>
+    <w:p>
+      <w:pPr>
+        <w:spacing w:after="0" w:line="240" w:lineRule="auto"/>
+        <w:ind w:left="360"/>
+        <w:rPr>
+          <w:rFonts w:ascii="Verdana" w:eastAsia="Times New Roman" w:hAnsi="Verdana" w:cs="Tahoma"/>
+          <w:color w:val="2A2A2A"/>
+          <w:sz w:val="20"/>
+          <w:szCs w:val="20"/>
+          <w:lang w:eastAsia="es-ES"/>
+        </w:rPr>
+      </w:pPr>
+    </w:p>
+    <w:p>
+      <w:pPr>
+        <w:spacing w:after="0" w:line="240" w:lineRule="auto"/>
+        <w:ind w:left="360"/>
+        <w:rPr>
+          <w:rFonts w:ascii="Verdana" w:eastAsia="Times New Roman" w:hAnsi="Verdana" w:cs="Tahoma"/>
+          <w:color w:val="2A2A2A"/>
+          <w:sz w:val="20"/>
+          <w:szCs w:val="20"/>
+          <w:lang w:eastAsia="es-ES"/>
+        </w:rPr>
+      </w:pPr>
+      <w:r>
+        <w:rPr>
+          <w:rFonts w:ascii="Verdana" w:eastAsia="Times New Roman" w:hAnsi="Verdana" w:cs="Tahoma"/>
+          <w:color w:val="2A2A2A"/>
+          <w:sz w:val="20"/>
+          <w:szCs w:val="20"/>
+          <w:lang w:eastAsia="es-ES"/>
+        </w:rPr>
+        <w:t>De manera negativa / error (errores controlados)</w:t>
+      </w:r>
+    </w:p>
+    <w:p>
+      <w:pPr>
+        <w:spacing w:after="0" w:line="240" w:lineRule="auto"/>
+        <w:ind w:left="360"/>
+        <w:rPr>
+          <w:rFonts w:ascii="Verdana" w:eastAsia="Times New Roman" w:hAnsi="Verdana" w:cs="Tahoma"/>
+          <w:color w:val="2A2A2A"/>
+          <w:sz w:val="20"/>
+          <w:szCs w:val="20"/>
+          <w:lang w:eastAsia="es-ES"/>
+        </w:rPr>
+      </w:pPr>
+      <w:r>
+        <w:rPr>
+          <w:rFonts w:ascii="Verdana" w:eastAsia="Times New Roman" w:hAnsi="Verdana" w:cs="Tahoma"/>
+          <w:color w:val="2A2A2A"/>
+          <w:sz w:val="20"/>
+          <w:szCs w:val="20"/>
+          <w:lang w:eastAsia="es-ES"/>
+        </w:rPr>
+        <w:t xml:space="preserve">X </w:t>
+      </w:r>
+      <w:proofErr w:type="spellStart"/>
+      <w:proofErr w:type="gramStart"/>
+      <w:r>
+        <w:rPr>
+          <w:rFonts w:ascii="Verdana" w:eastAsia="Times New Roman" w:hAnsi="Verdana" w:cs="Tahoma"/>
+          <w:color w:val="2A2A2A"/>
+          <w:sz w:val="20"/>
+          <w:szCs w:val="20"/>
+          <w:lang w:eastAsia="es-ES"/>
+        </w:rPr>
+        <w:t>devuelveFecha</w:t>
+      </w:r>
+      <w:proofErr w:type="spellEnd"/>
+      <w:r>
+        <w:rPr>
+          <w:rFonts w:ascii="Verdana" w:eastAsia="Times New Roman" w:hAnsi="Verdana" w:cs="Tahoma"/>
+          <w:color w:val="2A2A2A"/>
+          <w:sz w:val="20"/>
+          <w:szCs w:val="20"/>
+          <w:lang w:eastAsia="es-ES"/>
+        </w:rPr>
+        <w:t>(</w:t>
+      </w:r>
+      <w:proofErr w:type="gramEnd"/>
+      <w:r>
+        <w:rPr>
+          <w:rFonts w:ascii="Verdana" w:eastAsia="Times New Roman" w:hAnsi="Verdana" w:cs="Tahoma"/>
+          <w:color w:val="2A2A2A"/>
+          <w:sz w:val="20"/>
+          <w:szCs w:val="20"/>
+          <w:lang w:eastAsia="es-ES"/>
+        </w:rPr>
+        <w:t>0) -&gt; se espera "ERROR" y longitud 5</w:t>
+      </w:r>
+    </w:p>
+    <w:p>
+      <w:pPr>
+        <w:spacing w:after="0" w:line="240" w:lineRule="auto"/>
+        <w:ind w:left="360"/>
+        <w:rPr>
+          <w:rFonts w:ascii="Verdana" w:eastAsia="Times New Roman" w:hAnsi="Verdana" w:cs="Tahoma"/>
+          <w:color w:val="2A2A2A"/>
+          <w:sz w:val="20"/>
+          <w:szCs w:val="20"/>
+          <w:lang w:eastAsia="es-ES"/>
+        </w:rPr>
+      </w:pPr>
+    </w:p>
+    <w:p>
+      <w:pPr>
+        <w:spacing w:after="0" w:line="240" w:lineRule="auto"/>
+        <w:ind w:left="360"/>
+        <w:rPr>
+          <w:rFonts w:ascii="Verdana" w:eastAsia="Times New Roman" w:hAnsi="Verdana" w:cs="Tahoma"/>
+          <w:color w:val="2A2A2A"/>
+          <w:sz w:val="20"/>
+          <w:szCs w:val="20"/>
+          <w:lang w:eastAsia="es-ES"/>
+        </w:rPr>
+      </w:pPr>
+      <w:r>
+        <w:rPr>
+          <w:rFonts w:ascii="Verdana" w:eastAsia="Times New Roman" w:hAnsi="Verdana" w:cs="Tahoma"/>
+          <w:color w:val="2A2A2A"/>
+          <w:sz w:val="20"/>
+          <w:szCs w:val="20"/>
+          <w:lang w:eastAsia="es-ES"/>
+        </w:rPr>
+        <w:t>Para poder realizar los test de manera metódica y eficiente, u</w:t>
+      </w:r>
+      <w:r>
+        <w:rPr>
+          <w:rFonts w:ascii="Verdana" w:eastAsia="Times New Roman" w:hAnsi="Verdana" w:cs="Tahoma"/>
+          <w:color w:val="2A2A2A"/>
+          <w:sz w:val="20"/>
+          <w:szCs w:val="20"/>
+          <w:lang w:eastAsia="es-ES"/>
+        </w:rPr>
+        <w:t xml:space="preserve">tilizamos la ayuda </w:t>
+      </w:r>
+      <w:proofErr w:type="spellStart"/>
+      <w:r>
+        <w:rPr>
+          <w:rFonts w:ascii="Verdana" w:eastAsia="Times New Roman" w:hAnsi="Verdana" w:cs="Tahoma"/>
+          <w:color w:val="2A2A2A"/>
+          <w:sz w:val="20"/>
+          <w:szCs w:val="20"/>
+          <w:lang w:eastAsia="es-ES"/>
+        </w:rPr>
+        <w:t>de el</w:t>
+      </w:r>
+      <w:proofErr w:type="spellEnd"/>
+      <w:r>
+        <w:rPr>
+          <w:rFonts w:ascii="Verdana" w:eastAsia="Times New Roman" w:hAnsi="Verdana" w:cs="Tahoma"/>
+          <w:color w:val="2A2A2A"/>
+          <w:sz w:val="20"/>
+          <w:szCs w:val="20"/>
+          <w:lang w:eastAsia="es-ES"/>
+        </w:rPr>
+        <w:t xml:space="preserve"> método de caja blanca para saber cuales serian los </w:t>
+      </w:r>
+      <w:r>
+        <w:rPr>
+          <w:rFonts w:ascii="Verdana" w:eastAsia="Times New Roman" w:hAnsi="Verdana" w:cs="Tahoma"/>
+          <w:color w:val="2A2A2A"/>
+          <w:sz w:val="20"/>
+          <w:szCs w:val="20"/>
+          <w:lang w:eastAsia="es-ES"/>
+        </w:rPr>
+        <w:t>resultados esperados correctos e incorrectos y luego nos ayudaríamos de la caja negra para implementar todos los test que ahí aparecen, tanto los positivos como los de error</w:t>
+      </w:r>
+      <w:r>
+        <w:rPr>
+          <w:rFonts w:ascii="Verdana" w:eastAsia="Times New Roman" w:hAnsi="Verdana" w:cs="Tahoma"/>
+          <w:color w:val="2A2A2A"/>
+          <w:sz w:val="20"/>
+          <w:szCs w:val="20"/>
+          <w:lang w:eastAsia="es-ES"/>
+        </w:rPr>
+        <w:t xml:space="preserve"> y comprobamos en la aplicación que se cumplen.</w:t>
+      </w:r>
+    </w:p>
+    <w:p>
+      <w:pPr>
+        <w:spacing w:after="0" w:line="240" w:lineRule="auto"/>
+        <w:ind w:left="360"/>
+        <w:rPr>
+          <w:rFonts w:ascii="Verdana" w:eastAsia="Times New Roman" w:hAnsi="Verdana" w:cs="Tahoma"/>
+          <w:color w:val="2A2A2A"/>
+          <w:sz w:val="20"/>
+          <w:szCs w:val="20"/>
+          <w:lang w:eastAsia="es-ES"/>
+        </w:rPr>
+      </w:pPr>
+    </w:p>
+    <w:p>
+      <w:pPr>
         <w:pStyle w:val="Prrafodelista"/>
         <w:spacing w:after="0" w:line="240" w:lineRule="auto"/>
         <w:rPr>
@@ -1004,11 +1545,577 @@
     </w:p>
     <w:p>
       <w:pPr>
+        <w:pStyle w:val="Ttulo2"/>
+        <w:rPr>
+          <w:rFonts w:ascii="Verdana" w:eastAsiaTheme="minorHAnsi" w:hAnsi="Verdana" w:cstheme="minorBidi"/>
+          <w:color w:val="auto"/>
+          <w:sz w:val="20"/>
+          <w:szCs w:val="20"/>
+        </w:rPr>
+      </w:pPr>
+      <w:bookmarkStart w:id="2" w:name="_Toc220698173"/>
+      <w:r>
+        <w:rPr>
+          <w:rFonts w:eastAsia="Times New Roman"/>
+          <w:lang w:eastAsia="es-ES"/>
+        </w:rPr>
+        <w:t xml:space="preserve">Escribe una clase de pruebas para el método </w:t>
+      </w:r>
+      <w:proofErr w:type="spellStart"/>
+      <w:r>
+        <w:rPr>
+          <w:rFonts w:eastAsia="Times New Roman"/>
+          <w:lang w:eastAsia="es-ES"/>
+        </w:rPr>
+        <w:t>calculo</w:t>
+      </w:r>
+      <w:proofErr w:type="spellEnd"/>
+      <w:r>
+        <w:rPr>
+          <w:rFonts w:eastAsia="Times New Roman"/>
+          <w:lang w:eastAsia="es-ES"/>
+        </w:rPr>
+        <w:t xml:space="preserve"> de la </w:t>
+      </w:r>
+      <w:proofErr w:type="spellStart"/>
+      <w:r>
+        <w:rPr>
+          <w:rFonts w:eastAsia="Times New Roman"/>
+          <w:lang w:eastAsia="es-ES"/>
+        </w:rPr>
+        <w:t>calse</w:t>
+      </w:r>
+      <w:proofErr w:type="spellEnd"/>
+      <w:r>
+        <w:rPr>
+          <w:rFonts w:eastAsia="Times New Roman"/>
+          <w:lang w:eastAsia="es-ES"/>
+        </w:rPr>
+        <w:t xml:space="preserve"> Factorial. En el método se comprueba si el número es menor que 0, en este caso se lanza la excepción </w:t>
+      </w:r>
+      <w:proofErr w:type="spellStart"/>
+      <w:r>
+        <w:rPr>
+          <w:rFonts w:eastAsia="Times New Roman"/>
+          <w:lang w:eastAsia="es-ES"/>
+        </w:rPr>
+        <w:t>IllegalArgumentException</w:t>
+      </w:r>
+      <w:proofErr w:type="spellEnd"/>
+      <w:r>
+        <w:rPr>
+          <w:rFonts w:eastAsia="Times New Roman"/>
+          <w:lang w:eastAsia="es-ES"/>
+        </w:rPr>
+        <w:t xml:space="preserve"> con el mensaje “El </w:t>
+      </w:r>
+      <w:proofErr w:type="spellStart"/>
+      <w:r>
+        <w:rPr>
+          <w:rFonts w:eastAsia="Times New Roman"/>
+          <w:lang w:eastAsia="es-ES"/>
+        </w:rPr>
+        <w:t>numero</w:t>
+      </w:r>
+      <w:proofErr w:type="spellEnd"/>
+      <w:r>
+        <w:rPr>
+          <w:rFonts w:eastAsia="Times New Roman"/>
+          <w:lang w:eastAsia="es-ES"/>
+        </w:rPr>
+        <w:t xml:space="preserve"> no puede ser negativo o 0”. Si el valor del </w:t>
+      </w:r>
+      <w:proofErr w:type="gramStart"/>
+      <w:r>
+        <w:rPr>
+          <w:rFonts w:eastAsia="Times New Roman"/>
+          <w:lang w:eastAsia="es-ES"/>
+        </w:rPr>
+        <w:t>factorial calculado</w:t>
+      </w:r>
+      <w:proofErr w:type="gramEnd"/>
+      <w:r>
+        <w:rPr>
+          <w:rFonts w:eastAsia="Times New Roman"/>
+          <w:lang w:eastAsia="es-ES"/>
+        </w:rPr>
+        <w:t xml:space="preserve"> es menor que 0 es que ha ocurrido un error de desbordamiento, en este caso se lanza la excepción </w:t>
+      </w:r>
+      <w:proofErr w:type="spellStart"/>
+      <w:r>
+        <w:rPr>
+          <w:rFonts w:eastAsia="Times New Roman"/>
+          <w:lang w:eastAsia="es-ES"/>
+        </w:rPr>
+        <w:t>ArithmeticException</w:t>
+      </w:r>
+      <w:proofErr w:type="spellEnd"/>
+      <w:r>
+        <w:rPr>
+          <w:rFonts w:eastAsia="Times New Roman"/>
+          <w:lang w:eastAsia="es-ES"/>
+        </w:rPr>
+        <w:t xml:space="preserve"> y se lanza el mensaje “</w:t>
+      </w:r>
+      <w:proofErr w:type="spellStart"/>
+      <w:r>
+        <w:rPr>
+          <w:rFonts w:eastAsia="Times New Roman"/>
+          <w:lang w:eastAsia="es-ES"/>
+        </w:rPr>
+        <w:t>Overflow</w:t>
+      </w:r>
+      <w:proofErr w:type="spellEnd"/>
+      <w:r>
+        <w:rPr>
+          <w:rFonts w:eastAsia="Times New Roman"/>
+          <w:lang w:eastAsia="es-ES"/>
+        </w:rPr>
+        <w:t>”. La clase a probar es la siguiente:</w:t>
+      </w:r>
+      <w:bookmarkEnd w:id="2"/>
+    </w:p>
+    <w:p>
+      <w:pPr>
         <w:pStyle w:val="Prrafodelista"/>
-        <w:numPr>
-          <w:ilvl w:val="0"/>
-          <w:numId w:val="1"/>
-        </w:numPr>
+        <w:rPr>
+          <w:rFonts w:ascii="Verdana" w:hAnsi="Verdana"/>
+          <w:sz w:val="20"/>
+          <w:szCs w:val="20"/>
+        </w:rPr>
+      </w:pPr>
+    </w:p>
+    <w:p>
+      <w:pPr>
+        <w:pStyle w:val="Prrafodelista"/>
+        <w:rPr>
+          <w:rFonts w:ascii="Verdana" w:hAnsi="Verdana"/>
+          <w:sz w:val="20"/>
+          <w:szCs w:val="20"/>
+        </w:rPr>
+      </w:pPr>
+      <w:r>
+        <w:rPr>
+          <w:rFonts w:ascii="Verdana" w:hAnsi="Verdana"/>
+          <w:noProof/>
+          <w:sz w:val="20"/>
+          <w:szCs w:val="20"/>
+        </w:rPr>
+        <w:drawing>
+          <wp:inline distT="0" distB="0" distL="0" distR="0" wp14:anchorId="18E92230" wp14:editId="453CFB05">
+            <wp:extent cx="5400040" cy="3655060"/>
+            <wp:effectExtent l="0" t="0" r="0" b="2540"/>
+            <wp:docPr id="506425548" name="Imagen 12"/>
+            <wp:cNvGraphicFramePr>
+              <a:graphicFrameLocks xmlns:a="http://schemas.openxmlformats.org/drawingml/2006/main" noChangeAspect="1"/>
+            </wp:cNvGraphicFramePr>
+            <a:graphic xmlns:a="http://schemas.openxmlformats.org/drawingml/2006/main">
+              <a:graphicData uri="http://schemas.openxmlformats.org/drawingml/2006/picture">
+                <pic:pic xmlns:pic="http://schemas.openxmlformats.org/drawingml/2006/picture">
+                  <pic:nvPicPr>
+                    <pic:cNvPr id="506425548" name=""/>
+                    <pic:cNvPicPr/>
+                  </pic:nvPicPr>
+                  <pic:blipFill>
+                    <a:blip r:embed="rId14">
+                      <a:extLst>
+                        <a:ext uri="{28A0092B-C50C-407E-A947-70E740481C1C}">
+                          <a14:useLocalDpi xmlns:a14="http://schemas.microsoft.com/office/drawing/2010/main" val="0"/>
+                        </a:ext>
+                      </a:extLst>
+                    </a:blip>
+                    <a:stretch>
+                      <a:fillRect/>
+                    </a:stretch>
+                  </pic:blipFill>
+                  <pic:spPr>
+                    <a:xfrm>
+                      <a:off x="0" y="0"/>
+                      <a:ext cx="5400040" cy="3655060"/>
+                    </a:xfrm>
+                    <a:prstGeom prst="rect">
+                      <a:avLst/>
+                    </a:prstGeom>
+                  </pic:spPr>
+                </pic:pic>
+              </a:graphicData>
+            </a:graphic>
+          </wp:inline>
+        </w:drawing>
+      </w:r>
+    </w:p>
+    <w:p>
+      <w:pPr>
+        <w:pStyle w:val="Prrafodelista"/>
+        <w:rPr>
+          <w:rFonts w:ascii="Verdana" w:hAnsi="Verdana"/>
+          <w:sz w:val="20"/>
+          <w:szCs w:val="20"/>
+        </w:rPr>
+      </w:pPr>
+      <w:r>
+        <w:rPr>
+          <w:rFonts w:ascii="Verdana" w:hAnsi="Verdana"/>
+          <w:sz w:val="20"/>
+          <w:szCs w:val="20"/>
+        </w:rPr>
+        <w:t>Y según este código hacemos su correspondiente clase para el test, FactorialTest.java</w:t>
+      </w:r>
+    </w:p>
+    <w:p>
+      <w:pPr>
+        <w:pStyle w:val="Prrafodelista"/>
+        <w:rPr>
+          <w:rFonts w:ascii="Verdana" w:hAnsi="Verdana"/>
+          <w:sz w:val="20"/>
+          <w:szCs w:val="20"/>
+        </w:rPr>
+      </w:pPr>
+      <w:r>
+        <w:rPr>
+          <w:rFonts w:ascii="Verdana" w:eastAsia="Times New Roman" w:hAnsi="Verdana" w:cs="Tahoma"/>
+          <w:noProof/>
+          <w:color w:val="2A2A2A"/>
+          <w:sz w:val="20"/>
+          <w:szCs w:val="20"/>
+          <w:lang w:eastAsia="es-ES"/>
+        </w:rPr>
+        <w:lastRenderedPageBreak/>
+        <w:drawing>
+          <wp:inline distT="0" distB="0" distL="0" distR="0" wp14:anchorId="46F1EBBA" wp14:editId="1CE21854">
+            <wp:extent cx="5400040" cy="6228715"/>
+            <wp:effectExtent l="0" t="0" r="0" b="635"/>
+            <wp:docPr id="1856792513" name="Imagen 7"/>
+            <wp:cNvGraphicFramePr>
+              <a:graphicFrameLocks xmlns:a="http://schemas.openxmlformats.org/drawingml/2006/main" noChangeAspect="1"/>
+            </wp:cNvGraphicFramePr>
+            <a:graphic xmlns:a="http://schemas.openxmlformats.org/drawingml/2006/main">
+              <a:graphicData uri="http://schemas.openxmlformats.org/drawingml/2006/picture">
+                <pic:pic xmlns:pic="http://schemas.openxmlformats.org/drawingml/2006/picture">
+                  <pic:nvPicPr>
+                    <pic:cNvPr id="1856792513" name=""/>
+                    <pic:cNvPicPr/>
+                  </pic:nvPicPr>
+                  <pic:blipFill>
+                    <a:blip r:embed="rId15">
+                      <a:extLst>
+                        <a:ext uri="{28A0092B-C50C-407E-A947-70E740481C1C}">
+                          <a14:useLocalDpi xmlns:a14="http://schemas.microsoft.com/office/drawing/2010/main" val="0"/>
+                        </a:ext>
+                      </a:extLst>
+                    </a:blip>
+                    <a:stretch>
+                      <a:fillRect/>
+                    </a:stretch>
+                  </pic:blipFill>
+                  <pic:spPr>
+                    <a:xfrm>
+                      <a:off x="0" y="0"/>
+                      <a:ext cx="5400040" cy="6228715"/>
+                    </a:xfrm>
+                    <a:prstGeom prst="rect">
+                      <a:avLst/>
+                    </a:prstGeom>
+                  </pic:spPr>
+                </pic:pic>
+              </a:graphicData>
+            </a:graphic>
+          </wp:inline>
+        </w:drawing>
+      </w:r>
+    </w:p>
+    <w:p>
+      <w:pPr>
+        <w:pStyle w:val="Prrafodelista"/>
+        <w:rPr>
+          <w:rFonts w:ascii="Verdana" w:hAnsi="Verdana"/>
+          <w:sz w:val="20"/>
+          <w:szCs w:val="20"/>
+        </w:rPr>
+      </w:pPr>
+      <w:r>
+        <w:rPr>
+          <w:rFonts w:ascii="Verdana" w:hAnsi="Verdana"/>
+          <w:sz w:val="20"/>
+          <w:szCs w:val="20"/>
+        </w:rPr>
+        <w:t>Aquí hemos chequeado lo siguiente:</w:t>
+      </w:r>
+    </w:p>
+    <w:p>
+      <w:pPr>
+        <w:pStyle w:val="Prrafodelista"/>
+        <w:rPr>
+          <w:rFonts w:ascii="Verdana" w:hAnsi="Verdana"/>
+          <w:sz w:val="20"/>
+          <w:szCs w:val="20"/>
+        </w:rPr>
+      </w:pPr>
+      <w:r>
+        <w:rPr>
+          <w:rFonts w:ascii="Verdana" w:hAnsi="Verdana"/>
+          <w:sz w:val="20"/>
+          <w:szCs w:val="20"/>
+        </w:rPr>
+        <w:t>De manera positiva (casos correctos)</w:t>
+      </w:r>
+    </w:p>
+    <w:p>
+      <w:pPr>
+        <w:pStyle w:val="Prrafodelista"/>
+        <w:rPr>
+          <w:rFonts w:ascii="Verdana" w:hAnsi="Verdana"/>
+          <w:sz w:val="20"/>
+          <w:szCs w:val="20"/>
+        </w:rPr>
+      </w:pPr>
+      <w:r>
+        <w:rPr>
+          <w:rFonts w:ascii="Verdana" w:hAnsi="Verdana"/>
+          <w:sz w:val="20"/>
+          <w:szCs w:val="20"/>
+        </w:rPr>
+        <w:t xml:space="preserve">* </w:t>
+      </w:r>
+      <w:proofErr w:type="gramStart"/>
+      <w:r>
+        <w:rPr>
+          <w:rFonts w:ascii="Verdana" w:hAnsi="Verdana"/>
+          <w:sz w:val="20"/>
+          <w:szCs w:val="20"/>
+        </w:rPr>
+        <w:t>calculo(</w:t>
+      </w:r>
+      <w:proofErr w:type="gramEnd"/>
+      <w:r>
+        <w:rPr>
+          <w:rFonts w:ascii="Verdana" w:hAnsi="Verdana"/>
+          <w:sz w:val="20"/>
+          <w:szCs w:val="20"/>
+        </w:rPr>
+        <w:t>5) -&gt; se espera 120</w:t>
+      </w:r>
+    </w:p>
+    <w:p>
+      <w:pPr>
+        <w:pStyle w:val="Prrafodelista"/>
+        <w:rPr>
+          <w:rFonts w:ascii="Verdana" w:hAnsi="Verdana"/>
+          <w:sz w:val="20"/>
+          <w:szCs w:val="20"/>
+        </w:rPr>
+      </w:pPr>
+      <w:r>
+        <w:rPr>
+          <w:rFonts w:ascii="Verdana" w:hAnsi="Verdana"/>
+          <w:sz w:val="20"/>
+          <w:szCs w:val="20"/>
+        </w:rPr>
+        <w:t xml:space="preserve">* </w:t>
+      </w:r>
+      <w:proofErr w:type="gramStart"/>
+      <w:r>
+        <w:rPr>
+          <w:rFonts w:ascii="Verdana" w:hAnsi="Verdana"/>
+          <w:sz w:val="20"/>
+          <w:szCs w:val="20"/>
+        </w:rPr>
+        <w:t>calculo(</w:t>
+      </w:r>
+      <w:proofErr w:type="gramEnd"/>
+      <w:r>
+        <w:rPr>
+          <w:rFonts w:ascii="Verdana" w:hAnsi="Verdana"/>
+          <w:sz w:val="20"/>
+          <w:szCs w:val="20"/>
+        </w:rPr>
+        <w:t>0) -&gt; se espera 1</w:t>
+      </w:r>
+    </w:p>
+    <w:p>
+      <w:pPr>
+        <w:pStyle w:val="Prrafodelista"/>
+        <w:rPr>
+          <w:rFonts w:ascii="Verdana" w:hAnsi="Verdana"/>
+          <w:sz w:val="20"/>
+          <w:szCs w:val="20"/>
+        </w:rPr>
+      </w:pPr>
+    </w:p>
+    <w:p>
+      <w:pPr>
+        <w:pStyle w:val="Prrafodelista"/>
+        <w:rPr>
+          <w:rFonts w:ascii="Verdana" w:hAnsi="Verdana"/>
+          <w:sz w:val="20"/>
+          <w:szCs w:val="20"/>
+        </w:rPr>
+      </w:pPr>
+      <w:r>
+        <w:rPr>
+          <w:rFonts w:ascii="Verdana" w:hAnsi="Verdana"/>
+          <w:sz w:val="20"/>
+          <w:szCs w:val="20"/>
+        </w:rPr>
+        <w:t>De manera negativa / error (errores controlados)</w:t>
+      </w:r>
+    </w:p>
+    <w:p>
+      <w:pPr>
+        <w:pStyle w:val="Prrafodelista"/>
+        <w:rPr>
+          <w:rFonts w:ascii="Verdana" w:hAnsi="Verdana"/>
+          <w:sz w:val="20"/>
+          <w:szCs w:val="20"/>
+        </w:rPr>
+      </w:pPr>
+      <w:r>
+        <w:rPr>
+          <w:rFonts w:ascii="Verdana" w:hAnsi="Verdana"/>
+          <w:sz w:val="20"/>
+          <w:szCs w:val="20"/>
+        </w:rPr>
+        <w:t xml:space="preserve">X </w:t>
+      </w:r>
+      <w:proofErr w:type="gramStart"/>
+      <w:r>
+        <w:rPr>
+          <w:rFonts w:ascii="Verdana" w:hAnsi="Verdana"/>
+          <w:sz w:val="20"/>
+          <w:szCs w:val="20"/>
+        </w:rPr>
+        <w:t>calculo(</w:t>
+      </w:r>
+      <w:proofErr w:type="gramEnd"/>
+      <w:r>
+        <w:rPr>
+          <w:rFonts w:ascii="Verdana" w:hAnsi="Verdana"/>
+          <w:sz w:val="20"/>
+          <w:szCs w:val="20"/>
+        </w:rPr>
+        <w:t xml:space="preserve">-1) -&gt; se espera </w:t>
+      </w:r>
+      <w:proofErr w:type="spellStart"/>
+      <w:r>
+        <w:rPr>
+          <w:rFonts w:ascii="Verdana" w:hAnsi="Verdana"/>
+          <w:sz w:val="20"/>
+          <w:szCs w:val="20"/>
+        </w:rPr>
+        <w:t>IllegalArgumentException</w:t>
+      </w:r>
+      <w:proofErr w:type="spellEnd"/>
+      <w:r>
+        <w:rPr>
+          <w:rFonts w:ascii="Verdana" w:hAnsi="Verdana"/>
+          <w:sz w:val="20"/>
+          <w:szCs w:val="20"/>
+        </w:rPr>
+        <w:t xml:space="preserve"> con mensaje "El </w:t>
+      </w:r>
+      <w:proofErr w:type="spellStart"/>
+      <w:r>
+        <w:rPr>
+          <w:rFonts w:ascii="Verdana" w:hAnsi="Verdana"/>
+          <w:sz w:val="20"/>
+          <w:szCs w:val="20"/>
+        </w:rPr>
+        <w:t>numero</w:t>
+      </w:r>
+      <w:proofErr w:type="spellEnd"/>
+      <w:r>
+        <w:rPr>
+          <w:rFonts w:ascii="Verdana" w:hAnsi="Verdana"/>
+          <w:sz w:val="20"/>
+          <w:szCs w:val="20"/>
+        </w:rPr>
+        <w:t xml:space="preserve"> no puede ser negativo o 0"</w:t>
+      </w:r>
+    </w:p>
+    <w:p>
+      <w:pPr>
+        <w:pStyle w:val="Prrafodelista"/>
+        <w:rPr>
+          <w:rFonts w:ascii="Verdana" w:hAnsi="Verdana"/>
+          <w:sz w:val="20"/>
+          <w:szCs w:val="20"/>
+        </w:rPr>
+      </w:pPr>
+      <w:r>
+        <w:rPr>
+          <w:rFonts w:ascii="Verdana" w:hAnsi="Verdana"/>
+          <w:sz w:val="20"/>
+          <w:szCs w:val="20"/>
+        </w:rPr>
+        <w:t xml:space="preserve">X </w:t>
+      </w:r>
+      <w:proofErr w:type="gramStart"/>
+      <w:r>
+        <w:rPr>
+          <w:rFonts w:ascii="Verdana" w:hAnsi="Verdana"/>
+          <w:sz w:val="20"/>
+          <w:szCs w:val="20"/>
+        </w:rPr>
+        <w:t>calculo(</w:t>
+      </w:r>
+      <w:proofErr w:type="gramEnd"/>
+      <w:r>
+        <w:rPr>
+          <w:rFonts w:ascii="Verdana" w:hAnsi="Verdana"/>
+          <w:sz w:val="20"/>
+          <w:szCs w:val="20"/>
+        </w:rPr>
+        <w:t xml:space="preserve">17) -&gt; se espera </w:t>
+      </w:r>
+      <w:proofErr w:type="spellStart"/>
+      <w:r>
+        <w:rPr>
+          <w:rFonts w:ascii="Verdana" w:hAnsi="Verdana"/>
+          <w:sz w:val="20"/>
+          <w:szCs w:val="20"/>
+        </w:rPr>
+        <w:t>ArithmeticException</w:t>
+      </w:r>
+      <w:proofErr w:type="spellEnd"/>
+      <w:r>
+        <w:rPr>
+          <w:rFonts w:ascii="Verdana" w:hAnsi="Verdana"/>
+          <w:sz w:val="20"/>
+          <w:szCs w:val="20"/>
+        </w:rPr>
+        <w:t xml:space="preserve"> con mensaje "</w:t>
+      </w:r>
+      <w:proofErr w:type="spellStart"/>
+      <w:r>
+        <w:rPr>
+          <w:rFonts w:ascii="Verdana" w:hAnsi="Verdana"/>
+          <w:sz w:val="20"/>
+          <w:szCs w:val="20"/>
+        </w:rPr>
+        <w:t>Overflow</w:t>
+      </w:r>
+      <w:proofErr w:type="spellEnd"/>
+      <w:r>
+        <w:rPr>
+          <w:rFonts w:ascii="Verdana" w:hAnsi="Verdana"/>
+          <w:sz w:val="20"/>
+          <w:szCs w:val="20"/>
+        </w:rPr>
+        <w:t>"</w:t>
+      </w:r>
+    </w:p>
+    <w:p>
+      <w:pPr>
+        <w:pStyle w:val="Prrafodelista"/>
+        <w:rPr>
+          <w:rFonts w:ascii="Verdana" w:hAnsi="Verdana"/>
+          <w:sz w:val="20"/>
+          <w:szCs w:val="20"/>
+        </w:rPr>
+      </w:pPr>
+    </w:p>
+    <w:p>
+      <w:pPr>
         <w:spacing w:after="0" w:line="240" w:lineRule="auto"/>
         <w:rPr>
           <w:rFonts w:ascii="Verdana" w:hAnsi="Verdana"/>
@@ -1016,150 +2123,1034 @@
           <w:szCs w:val="20"/>
         </w:rPr>
       </w:pPr>
-      <w:r>
-        <w:rPr>
-          <w:rFonts w:ascii="Tahoma" w:eastAsia="Times New Roman" w:hAnsi="Tahoma" w:cs="Tahoma"/>
-          <w:color w:val="2A2A2A"/>
-          <w:lang w:eastAsia="es-ES"/>
-        </w:rPr>
-        <w:t xml:space="preserve">Escribe una clase de pruebas para el método </w:t>
+    </w:p>
+    <w:p>
+      <w:pPr>
+        <w:pStyle w:val="Ttulo2"/>
+        <w:rPr>
+          <w:rFonts w:ascii="Verdana" w:eastAsiaTheme="minorHAnsi" w:hAnsi="Verdana" w:cstheme="minorBidi"/>
+          <w:color w:val="auto"/>
+          <w:sz w:val="20"/>
+          <w:szCs w:val="20"/>
+        </w:rPr>
+      </w:pPr>
+      <w:bookmarkStart w:id="3" w:name="_Toc220698174"/>
+      <w:r>
+        <w:rPr>
+          <w:rFonts w:eastAsia="Times New Roman"/>
+          <w:lang w:eastAsia="es-ES"/>
+        </w:rPr>
+        <w:lastRenderedPageBreak/>
+        <w:t xml:space="preserve">Analiza el código de la siguiente clase y desarrolla una batería de pruebas en </w:t>
       </w:r>
       <w:proofErr w:type="spellStart"/>
       <w:r>
         <w:rPr>
-          <w:rFonts w:ascii="Tahoma" w:eastAsia="Times New Roman" w:hAnsi="Tahoma" w:cs="Tahoma"/>
-          <w:color w:val="2A2A2A"/>
-          <w:lang w:eastAsia="es-ES"/>
-        </w:rPr>
-        <w:t>calculo</w:t>
+          <w:rFonts w:eastAsia="Times New Roman"/>
+          <w:lang w:eastAsia="es-ES"/>
+        </w:rPr>
+        <w:t>JUnit</w:t>
       </w:r>
       <w:proofErr w:type="spellEnd"/>
       <w:r>
         <w:rPr>
-          <w:rFonts w:ascii="Tahoma" w:eastAsia="Times New Roman" w:hAnsi="Tahoma" w:cs="Tahoma"/>
-          <w:color w:val="2A2A2A"/>
-          <w:lang w:eastAsia="es-ES"/>
-        </w:rPr>
-        <w:t xml:space="preserve"> de la </w:t>
+          <w:rFonts w:eastAsia="Times New Roman"/>
+          <w:lang w:eastAsia="es-ES"/>
+        </w:rPr>
+        <w:t xml:space="preserve"> para cada uno de los métodos y constructores.</w:t>
+      </w:r>
+      <w:bookmarkEnd w:id="3"/>
+    </w:p>
+    <w:p>
+      <w:pPr>
+        <w:spacing w:after="0" w:line="240" w:lineRule="auto"/>
+        <w:rPr>
+          <w:rFonts w:ascii="Verdana" w:hAnsi="Verdana"/>
+          <w:sz w:val="20"/>
+          <w:szCs w:val="20"/>
+        </w:rPr>
+      </w:pPr>
+      <w:r>
+        <w:rPr>
+          <w:rFonts w:ascii="Verdana" w:hAnsi="Verdana"/>
+          <w:noProof/>
+          <w:sz w:val="20"/>
+          <w:szCs w:val="20"/>
+        </w:rPr>
+        <w:drawing>
+          <wp:inline distT="0" distB="0" distL="0" distR="0" wp14:anchorId="06ED42FE" wp14:editId="65A6315E">
+            <wp:extent cx="5400040" cy="6381750"/>
+            <wp:effectExtent l="0" t="0" r="0" b="0"/>
+            <wp:docPr id="1024204078" name="Imagen 11"/>
+            <wp:cNvGraphicFramePr>
+              <a:graphicFrameLocks xmlns:a="http://schemas.openxmlformats.org/drawingml/2006/main" noChangeAspect="1"/>
+            </wp:cNvGraphicFramePr>
+            <a:graphic xmlns:a="http://schemas.openxmlformats.org/drawingml/2006/main">
+              <a:graphicData uri="http://schemas.openxmlformats.org/drawingml/2006/picture">
+                <pic:pic xmlns:pic="http://schemas.openxmlformats.org/drawingml/2006/picture">
+                  <pic:nvPicPr>
+                    <pic:cNvPr id="1024204078" name=""/>
+                    <pic:cNvPicPr/>
+                  </pic:nvPicPr>
+                  <pic:blipFill>
+                    <a:blip r:embed="rId16">
+                      <a:extLst>
+                        <a:ext uri="{28A0092B-C50C-407E-A947-70E740481C1C}">
+                          <a14:useLocalDpi xmlns:a14="http://schemas.microsoft.com/office/drawing/2010/main" val="0"/>
+                        </a:ext>
+                      </a:extLst>
+                    </a:blip>
+                    <a:stretch>
+                      <a:fillRect/>
+                    </a:stretch>
+                  </pic:blipFill>
+                  <pic:spPr>
+                    <a:xfrm>
+                      <a:off x="0" y="0"/>
+                      <a:ext cx="5400040" cy="6381750"/>
+                    </a:xfrm>
+                    <a:prstGeom prst="rect">
+                      <a:avLst/>
+                    </a:prstGeom>
+                  </pic:spPr>
+                </pic:pic>
+              </a:graphicData>
+            </a:graphic>
+          </wp:inline>
+        </w:drawing>
+      </w:r>
+    </w:p>
+    <w:p>
+      <w:pPr>
+        <w:spacing w:after="0" w:line="240" w:lineRule="auto"/>
+        <w:rPr>
+          <w:rFonts w:ascii="Verdana" w:hAnsi="Verdana"/>
+          <w:sz w:val="20"/>
+          <w:szCs w:val="20"/>
+        </w:rPr>
+      </w:pPr>
+      <w:r>
+        <w:rPr>
+          <w:rFonts w:ascii="Verdana" w:hAnsi="Verdana"/>
+          <w:sz w:val="20"/>
+          <w:szCs w:val="20"/>
+        </w:rPr>
+        <w:t>Este es el código y este seria la clase test TablaEnterosTest.java</w:t>
+      </w:r>
+    </w:p>
+    <w:p>
+      <w:pPr>
+        <w:spacing w:after="0" w:line="240" w:lineRule="auto"/>
+        <w:rPr>
+          <w:rFonts w:ascii="Verdana" w:hAnsi="Verdana"/>
+          <w:sz w:val="20"/>
+          <w:szCs w:val="20"/>
+        </w:rPr>
+      </w:pPr>
+      <w:r>
+        <w:rPr>
+          <w:rFonts w:ascii="Verdana" w:hAnsi="Verdana"/>
+          <w:noProof/>
+          <w:sz w:val="20"/>
+          <w:szCs w:val="20"/>
+        </w:rPr>
+        <w:lastRenderedPageBreak/>
+        <w:drawing>
+          <wp:inline distT="0" distB="0" distL="0" distR="0" wp14:anchorId="04110D68" wp14:editId="59C7664D">
+            <wp:extent cx="5400040" cy="6442710"/>
+            <wp:effectExtent l="0" t="0" r="0" b="0"/>
+            <wp:docPr id="348774691" name="Imagen 13"/>
+            <wp:cNvGraphicFramePr>
+              <a:graphicFrameLocks xmlns:a="http://schemas.openxmlformats.org/drawingml/2006/main" noChangeAspect="1"/>
+            </wp:cNvGraphicFramePr>
+            <a:graphic xmlns:a="http://schemas.openxmlformats.org/drawingml/2006/main">
+              <a:graphicData uri="http://schemas.openxmlformats.org/drawingml/2006/picture">
+                <pic:pic xmlns:pic="http://schemas.openxmlformats.org/drawingml/2006/picture">
+                  <pic:nvPicPr>
+                    <pic:cNvPr id="348774691" name=""/>
+                    <pic:cNvPicPr/>
+                  </pic:nvPicPr>
+                  <pic:blipFill>
+                    <a:blip r:embed="rId17">
+                      <a:extLst>
+                        <a:ext uri="{28A0092B-C50C-407E-A947-70E740481C1C}">
+                          <a14:useLocalDpi xmlns:a14="http://schemas.microsoft.com/office/drawing/2010/main" val="0"/>
+                        </a:ext>
+                      </a:extLst>
+                    </a:blip>
+                    <a:stretch>
+                      <a:fillRect/>
+                    </a:stretch>
+                  </pic:blipFill>
+                  <pic:spPr>
+                    <a:xfrm>
+                      <a:off x="0" y="0"/>
+                      <a:ext cx="5400040" cy="6442710"/>
+                    </a:xfrm>
+                    <a:prstGeom prst="rect">
+                      <a:avLst/>
+                    </a:prstGeom>
+                  </pic:spPr>
+                </pic:pic>
+              </a:graphicData>
+            </a:graphic>
+          </wp:inline>
+        </w:drawing>
+      </w:r>
+      <w:r>
+        <w:rPr>
+          <w:rFonts w:ascii="Verdana" w:hAnsi="Verdana"/>
+          <w:noProof/>
+          <w:sz w:val="20"/>
+          <w:szCs w:val="20"/>
+        </w:rPr>
+        <w:lastRenderedPageBreak/>
+        <w:drawing>
+          <wp:inline distT="0" distB="0" distL="0" distR="0" wp14:anchorId="10F9A69F" wp14:editId="10BAF976">
+            <wp:extent cx="5400040" cy="6860540"/>
+            <wp:effectExtent l="0" t="0" r="0" b="0"/>
+            <wp:docPr id="314763976" name="Imagen 14"/>
+            <wp:cNvGraphicFramePr>
+              <a:graphicFrameLocks xmlns:a="http://schemas.openxmlformats.org/drawingml/2006/main" noChangeAspect="1"/>
+            </wp:cNvGraphicFramePr>
+            <a:graphic xmlns:a="http://schemas.openxmlformats.org/drawingml/2006/main">
+              <a:graphicData uri="http://schemas.openxmlformats.org/drawingml/2006/picture">
+                <pic:pic xmlns:pic="http://schemas.openxmlformats.org/drawingml/2006/picture">
+                  <pic:nvPicPr>
+                    <pic:cNvPr id="314763976" name=""/>
+                    <pic:cNvPicPr/>
+                  </pic:nvPicPr>
+                  <pic:blipFill>
+                    <a:blip r:embed="rId18">
+                      <a:extLst>
+                        <a:ext uri="{28A0092B-C50C-407E-A947-70E740481C1C}">
+                          <a14:useLocalDpi xmlns:a14="http://schemas.microsoft.com/office/drawing/2010/main" val="0"/>
+                        </a:ext>
+                      </a:extLst>
+                    </a:blip>
+                    <a:stretch>
+                      <a:fillRect/>
+                    </a:stretch>
+                  </pic:blipFill>
+                  <pic:spPr>
+                    <a:xfrm>
+                      <a:off x="0" y="0"/>
+                      <a:ext cx="5400040" cy="6860540"/>
+                    </a:xfrm>
+                    <a:prstGeom prst="rect">
+                      <a:avLst/>
+                    </a:prstGeom>
+                  </pic:spPr>
+                </pic:pic>
+              </a:graphicData>
+            </a:graphic>
+          </wp:inline>
+        </w:drawing>
+      </w:r>
+      <w:r>
+        <w:rPr>
+          <w:rFonts w:ascii="Verdana" w:hAnsi="Verdana"/>
+          <w:noProof/>
+          <w:sz w:val="20"/>
+          <w:szCs w:val="20"/>
+        </w:rPr>
+        <w:lastRenderedPageBreak/>
+        <w:drawing>
+          <wp:inline distT="0" distB="0" distL="0" distR="0" wp14:anchorId="47935A6B" wp14:editId="3EA6F176">
+            <wp:extent cx="5400040" cy="3180080"/>
+            <wp:effectExtent l="0" t="0" r="0" b="1270"/>
+            <wp:docPr id="1830759942" name="Imagen 15"/>
+            <wp:cNvGraphicFramePr>
+              <a:graphicFrameLocks xmlns:a="http://schemas.openxmlformats.org/drawingml/2006/main" noChangeAspect="1"/>
+            </wp:cNvGraphicFramePr>
+            <a:graphic xmlns:a="http://schemas.openxmlformats.org/drawingml/2006/main">
+              <a:graphicData uri="http://schemas.openxmlformats.org/drawingml/2006/picture">
+                <pic:pic xmlns:pic="http://schemas.openxmlformats.org/drawingml/2006/picture">
+                  <pic:nvPicPr>
+                    <pic:cNvPr id="1830759942" name=""/>
+                    <pic:cNvPicPr/>
+                  </pic:nvPicPr>
+                  <pic:blipFill>
+                    <a:blip r:embed="rId19">
+                      <a:extLst>
+                        <a:ext uri="{28A0092B-C50C-407E-A947-70E740481C1C}">
+                          <a14:useLocalDpi xmlns:a14="http://schemas.microsoft.com/office/drawing/2010/main" val="0"/>
+                        </a:ext>
+                      </a:extLst>
+                    </a:blip>
+                    <a:stretch>
+                      <a:fillRect/>
+                    </a:stretch>
+                  </pic:blipFill>
+                  <pic:spPr>
+                    <a:xfrm>
+                      <a:off x="0" y="0"/>
+                      <a:ext cx="5400040" cy="3180080"/>
+                    </a:xfrm>
+                    <a:prstGeom prst="rect">
+                      <a:avLst/>
+                    </a:prstGeom>
+                  </pic:spPr>
+                </pic:pic>
+              </a:graphicData>
+            </a:graphic>
+          </wp:inline>
+        </w:drawing>
+      </w:r>
+    </w:p>
+    <w:p>
+      <w:pPr>
+        <w:spacing w:after="0" w:line="240" w:lineRule="auto"/>
+        <w:rPr>
+          <w:rFonts w:ascii="Verdana" w:hAnsi="Verdana"/>
+          <w:sz w:val="20"/>
+          <w:szCs w:val="20"/>
+        </w:rPr>
+      </w:pPr>
+      <w:r>
+        <w:rPr>
+          <w:rFonts w:ascii="Verdana" w:hAnsi="Verdana"/>
+          <w:sz w:val="20"/>
+          <w:szCs w:val="20"/>
+        </w:rPr>
+        <w:t>Hemos chequeado lo siguiente:</w:t>
+      </w:r>
+    </w:p>
+    <w:p>
+      <w:pPr>
+        <w:spacing w:after="0" w:line="240" w:lineRule="auto"/>
+        <w:rPr>
+          <w:rFonts w:ascii="Verdana" w:hAnsi="Verdana"/>
+          <w:sz w:val="20"/>
+          <w:szCs w:val="20"/>
+        </w:rPr>
+      </w:pPr>
+      <w:r>
+        <w:rPr>
+          <w:rFonts w:ascii="Verdana" w:hAnsi="Verdana"/>
+          <w:sz w:val="20"/>
+          <w:szCs w:val="20"/>
+        </w:rPr>
+        <w:t>De manera positiva (casos correctos)</w:t>
+      </w:r>
+    </w:p>
+    <w:p>
+      <w:pPr>
+        <w:spacing w:after="0" w:line="240" w:lineRule="auto"/>
+        <w:rPr>
+          <w:rFonts w:ascii="Verdana" w:hAnsi="Verdana"/>
+          <w:sz w:val="20"/>
+          <w:szCs w:val="20"/>
+        </w:rPr>
+      </w:pPr>
+      <w:r>
+        <w:rPr>
+          <w:rFonts w:ascii="Verdana" w:hAnsi="Verdana"/>
+          <w:sz w:val="20"/>
+          <w:szCs w:val="20"/>
+        </w:rPr>
+        <w:t xml:space="preserve">* new </w:t>
       </w:r>
       <w:proofErr w:type="spellStart"/>
-      <w:r>
-        <w:rPr>
-          <w:rFonts w:ascii="Tahoma" w:eastAsia="Times New Roman" w:hAnsi="Tahoma" w:cs="Tahoma"/>
-          <w:color w:val="2A2A2A"/>
-          <w:lang w:eastAsia="es-ES"/>
-        </w:rPr>
-        <w:t>calse</w:t>
+      <w:proofErr w:type="gramStart"/>
+      <w:r>
+        <w:rPr>
+          <w:rFonts w:ascii="Verdana" w:hAnsi="Verdana"/>
+          <w:sz w:val="20"/>
+          <w:szCs w:val="20"/>
+        </w:rPr>
+        <w:t>TablaEnteros</w:t>
       </w:r>
       <w:proofErr w:type="spellEnd"/>
       <w:r>
         <w:rPr>
-          <w:rFonts w:ascii="Tahoma" w:eastAsia="Times New Roman" w:hAnsi="Tahoma" w:cs="Tahoma"/>
-          <w:color w:val="2A2A2A"/>
-          <w:lang w:eastAsia="es-ES"/>
-        </w:rPr>
-        <w:t xml:space="preserve"> Factorial. En el método se comprueba si el número es menor que 0, en este caso se lanza la excepción </w:t>
+          <w:rFonts w:ascii="Verdana" w:hAnsi="Verdana"/>
+          <w:sz w:val="20"/>
+          <w:szCs w:val="20"/>
+        </w:rPr>
+        <w:t>(</w:t>
+      </w:r>
+      <w:proofErr w:type="gramEnd"/>
+      <w:r>
+        <w:rPr>
+          <w:rFonts w:ascii="Verdana" w:hAnsi="Verdana"/>
+          <w:sz w:val="20"/>
+          <w:szCs w:val="20"/>
+        </w:rPr>
+        <w:t xml:space="preserve">{1,2,3}) -&gt; se espera que cree el objeto (no </w:t>
       </w:r>
       <w:proofErr w:type="spellStart"/>
       <w:r>
         <w:rPr>
-          <w:rFonts w:ascii="Tahoma" w:eastAsia="Times New Roman" w:hAnsi="Tahoma" w:cs="Tahoma"/>
-          <w:color w:val="2A2A2A"/>
-          <w:lang w:eastAsia="es-ES"/>
+          <w:rFonts w:ascii="Verdana" w:hAnsi="Verdana"/>
+          <w:sz w:val="20"/>
+          <w:szCs w:val="20"/>
+        </w:rPr>
+        <w:t>null</w:t>
+      </w:r>
+      <w:proofErr w:type="spellEnd"/>
+      <w:r>
+        <w:rPr>
+          <w:rFonts w:ascii="Verdana" w:hAnsi="Verdana"/>
+          <w:sz w:val="20"/>
+          <w:szCs w:val="20"/>
+        </w:rPr>
+        <w:t>)</w:t>
+      </w:r>
+    </w:p>
+    <w:p>
+      <w:pPr>
+        <w:spacing w:after="0" w:line="240" w:lineRule="auto"/>
+        <w:rPr>
+          <w:rFonts w:ascii="Verdana" w:hAnsi="Verdana"/>
+          <w:sz w:val="20"/>
+          <w:szCs w:val="20"/>
+        </w:rPr>
+      </w:pPr>
+    </w:p>
+    <w:p>
+      <w:pPr>
+        <w:spacing w:after="0" w:line="240" w:lineRule="auto"/>
+        <w:rPr>
+          <w:rFonts w:ascii="Verdana" w:hAnsi="Verdana"/>
+          <w:sz w:val="20"/>
+          <w:szCs w:val="20"/>
+        </w:rPr>
+      </w:pPr>
+      <w:r>
+        <w:rPr>
+          <w:rFonts w:ascii="Verdana" w:hAnsi="Verdana"/>
+          <w:sz w:val="20"/>
+          <w:szCs w:val="20"/>
+        </w:rPr>
+        <w:t xml:space="preserve">* </w:t>
+      </w:r>
+      <w:proofErr w:type="spellStart"/>
+      <w:proofErr w:type="gramStart"/>
+      <w:r>
+        <w:rPr>
+          <w:rFonts w:ascii="Verdana" w:hAnsi="Verdana"/>
+          <w:sz w:val="20"/>
+          <w:szCs w:val="20"/>
+        </w:rPr>
+        <w:t>sumaTabla</w:t>
+      </w:r>
+      <w:proofErr w:type="spellEnd"/>
+      <w:r>
+        <w:rPr>
+          <w:rFonts w:ascii="Verdana" w:hAnsi="Verdana"/>
+          <w:sz w:val="20"/>
+          <w:szCs w:val="20"/>
+        </w:rPr>
+        <w:t>(</w:t>
+      </w:r>
+      <w:proofErr w:type="gramEnd"/>
+      <w:r>
+        <w:rPr>
+          <w:rFonts w:ascii="Verdana" w:hAnsi="Verdana"/>
+          <w:sz w:val="20"/>
+          <w:szCs w:val="20"/>
+        </w:rPr>
+        <w:t>) con {1,2,3,4,5} -&gt; se espera 15</w:t>
+      </w:r>
+    </w:p>
+    <w:p>
+      <w:pPr>
+        <w:spacing w:after="0" w:line="240" w:lineRule="auto"/>
+        <w:rPr>
+          <w:rFonts w:ascii="Verdana" w:hAnsi="Verdana"/>
+          <w:sz w:val="20"/>
+          <w:szCs w:val="20"/>
+        </w:rPr>
+      </w:pPr>
+      <w:r>
+        <w:rPr>
+          <w:rFonts w:ascii="Verdana" w:hAnsi="Verdana"/>
+          <w:sz w:val="20"/>
+          <w:szCs w:val="20"/>
+        </w:rPr>
+        <w:t xml:space="preserve">* </w:t>
+      </w:r>
+      <w:proofErr w:type="spellStart"/>
+      <w:proofErr w:type="gramStart"/>
+      <w:r>
+        <w:rPr>
+          <w:rFonts w:ascii="Verdana" w:hAnsi="Verdana"/>
+          <w:sz w:val="20"/>
+          <w:szCs w:val="20"/>
+        </w:rPr>
+        <w:t>sumaTabla</w:t>
+      </w:r>
+      <w:proofErr w:type="spellEnd"/>
+      <w:r>
+        <w:rPr>
+          <w:rFonts w:ascii="Verdana" w:hAnsi="Verdana"/>
+          <w:sz w:val="20"/>
+          <w:szCs w:val="20"/>
+        </w:rPr>
+        <w:t>(</w:t>
+      </w:r>
+      <w:proofErr w:type="gramEnd"/>
+      <w:r>
+        <w:rPr>
+          <w:rFonts w:ascii="Verdana" w:hAnsi="Verdana"/>
+          <w:sz w:val="20"/>
+          <w:szCs w:val="20"/>
+        </w:rPr>
+        <w:t>) con {-1,-2,-3,-4,-5} -&gt; se espera -15</w:t>
+      </w:r>
+    </w:p>
+    <w:p>
+      <w:pPr>
+        <w:spacing w:after="0" w:line="240" w:lineRule="auto"/>
+        <w:rPr>
+          <w:rFonts w:ascii="Verdana" w:hAnsi="Verdana"/>
+          <w:sz w:val="20"/>
+          <w:szCs w:val="20"/>
+        </w:rPr>
+      </w:pPr>
+      <w:r>
+        <w:rPr>
+          <w:rFonts w:ascii="Verdana" w:hAnsi="Verdana"/>
+          <w:sz w:val="20"/>
+          <w:szCs w:val="20"/>
+        </w:rPr>
+        <w:t xml:space="preserve">* </w:t>
+      </w:r>
+      <w:proofErr w:type="spellStart"/>
+      <w:proofErr w:type="gramStart"/>
+      <w:r>
+        <w:rPr>
+          <w:rFonts w:ascii="Verdana" w:hAnsi="Verdana"/>
+          <w:sz w:val="20"/>
+          <w:szCs w:val="20"/>
+        </w:rPr>
+        <w:t>sumaTabla</w:t>
+      </w:r>
+      <w:proofErr w:type="spellEnd"/>
+      <w:r>
+        <w:rPr>
+          <w:rFonts w:ascii="Verdana" w:hAnsi="Verdana"/>
+          <w:sz w:val="20"/>
+          <w:szCs w:val="20"/>
+        </w:rPr>
+        <w:t>(</w:t>
+      </w:r>
+      <w:proofErr w:type="gramEnd"/>
+      <w:r>
+        <w:rPr>
+          <w:rFonts w:ascii="Verdana" w:hAnsi="Verdana"/>
+          <w:sz w:val="20"/>
+          <w:szCs w:val="20"/>
+        </w:rPr>
+        <w:t>) con {0,0,0,0,0,0} -&gt; se espera 0</w:t>
+      </w:r>
+    </w:p>
+    <w:p>
+      <w:pPr>
+        <w:spacing w:after="0" w:line="240" w:lineRule="auto"/>
+        <w:rPr>
+          <w:rFonts w:ascii="Verdana" w:hAnsi="Verdana"/>
+          <w:sz w:val="20"/>
+          <w:szCs w:val="20"/>
+        </w:rPr>
+      </w:pPr>
+    </w:p>
+    <w:p>
+      <w:pPr>
+        <w:spacing w:after="0" w:line="240" w:lineRule="auto"/>
+        <w:rPr>
+          <w:rFonts w:ascii="Verdana" w:hAnsi="Verdana"/>
+          <w:sz w:val="20"/>
+          <w:szCs w:val="20"/>
+        </w:rPr>
+      </w:pPr>
+      <w:r>
+        <w:rPr>
+          <w:rFonts w:ascii="Verdana" w:hAnsi="Verdana"/>
+          <w:sz w:val="20"/>
+          <w:szCs w:val="20"/>
+        </w:rPr>
+        <w:t xml:space="preserve">* </w:t>
+      </w:r>
+      <w:proofErr w:type="spellStart"/>
+      <w:proofErr w:type="gramStart"/>
+      <w:r>
+        <w:rPr>
+          <w:rFonts w:ascii="Verdana" w:hAnsi="Verdana"/>
+          <w:sz w:val="20"/>
+          <w:szCs w:val="20"/>
+        </w:rPr>
+        <w:t>mayorTabla</w:t>
+      </w:r>
+      <w:proofErr w:type="spellEnd"/>
+      <w:r>
+        <w:rPr>
+          <w:rFonts w:ascii="Verdana" w:hAnsi="Verdana"/>
+          <w:sz w:val="20"/>
+          <w:szCs w:val="20"/>
+        </w:rPr>
+        <w:t>(</w:t>
+      </w:r>
+      <w:proofErr w:type="gramEnd"/>
+      <w:r>
+        <w:rPr>
+          <w:rFonts w:ascii="Verdana" w:hAnsi="Verdana"/>
+          <w:sz w:val="20"/>
+          <w:szCs w:val="20"/>
+        </w:rPr>
+        <w:t>) con {1,40,20,5,10} -&gt; se espera 40</w:t>
+      </w:r>
+    </w:p>
+    <w:p>
+      <w:pPr>
+        <w:spacing w:after="0" w:line="240" w:lineRule="auto"/>
+        <w:rPr>
+          <w:rFonts w:ascii="Verdana" w:hAnsi="Verdana"/>
+          <w:sz w:val="20"/>
+          <w:szCs w:val="20"/>
+        </w:rPr>
+      </w:pPr>
+      <w:r>
+        <w:rPr>
+          <w:rFonts w:ascii="Verdana" w:hAnsi="Verdana"/>
+          <w:sz w:val="20"/>
+          <w:szCs w:val="20"/>
+        </w:rPr>
+        <w:t xml:space="preserve">* </w:t>
+      </w:r>
+      <w:proofErr w:type="spellStart"/>
+      <w:proofErr w:type="gramStart"/>
+      <w:r>
+        <w:rPr>
+          <w:rFonts w:ascii="Verdana" w:hAnsi="Verdana"/>
+          <w:sz w:val="20"/>
+          <w:szCs w:val="20"/>
+        </w:rPr>
+        <w:t>mayorTabla</w:t>
+      </w:r>
+      <w:proofErr w:type="spellEnd"/>
+      <w:r>
+        <w:rPr>
+          <w:rFonts w:ascii="Verdana" w:hAnsi="Verdana"/>
+          <w:sz w:val="20"/>
+          <w:szCs w:val="20"/>
+        </w:rPr>
+        <w:t>(</w:t>
+      </w:r>
+      <w:proofErr w:type="gramEnd"/>
+      <w:r>
+        <w:rPr>
+          <w:rFonts w:ascii="Verdana" w:hAnsi="Verdana"/>
+          <w:sz w:val="20"/>
+          <w:szCs w:val="20"/>
+        </w:rPr>
+        <w:t>) con {-10,-5,-20,-100} -&gt; se espera -5</w:t>
+      </w:r>
+    </w:p>
+    <w:p>
+      <w:pPr>
+        <w:spacing w:after="0" w:line="240" w:lineRule="auto"/>
+        <w:rPr>
+          <w:rFonts w:ascii="Verdana" w:hAnsi="Verdana"/>
+          <w:sz w:val="20"/>
+          <w:szCs w:val="20"/>
+        </w:rPr>
+      </w:pPr>
+      <w:r>
+        <w:rPr>
+          <w:rFonts w:ascii="Verdana" w:hAnsi="Verdana"/>
+          <w:sz w:val="20"/>
+          <w:szCs w:val="20"/>
+        </w:rPr>
+        <w:t xml:space="preserve">* </w:t>
+      </w:r>
+      <w:proofErr w:type="spellStart"/>
+      <w:proofErr w:type="gramStart"/>
+      <w:r>
+        <w:rPr>
+          <w:rFonts w:ascii="Verdana" w:hAnsi="Verdana"/>
+          <w:sz w:val="20"/>
+          <w:szCs w:val="20"/>
+        </w:rPr>
+        <w:t>mayorTabla</w:t>
+      </w:r>
+      <w:proofErr w:type="spellEnd"/>
+      <w:r>
+        <w:rPr>
+          <w:rFonts w:ascii="Verdana" w:hAnsi="Verdana"/>
+          <w:sz w:val="20"/>
+          <w:szCs w:val="20"/>
+        </w:rPr>
+        <w:t>(</w:t>
+      </w:r>
+      <w:proofErr w:type="gramEnd"/>
+      <w:r>
+        <w:rPr>
+          <w:rFonts w:ascii="Verdana" w:hAnsi="Verdana"/>
+          <w:sz w:val="20"/>
+          <w:szCs w:val="20"/>
+        </w:rPr>
+        <w:t>) con {7} -&gt; se espera 7</w:t>
+      </w:r>
+    </w:p>
+    <w:p>
+      <w:pPr>
+        <w:spacing w:after="0" w:line="240" w:lineRule="auto"/>
+        <w:rPr>
+          <w:rFonts w:ascii="Verdana" w:hAnsi="Verdana"/>
+          <w:sz w:val="20"/>
+          <w:szCs w:val="20"/>
+        </w:rPr>
+      </w:pPr>
+    </w:p>
+    <w:p>
+      <w:pPr>
+        <w:spacing w:after="0" w:line="240" w:lineRule="auto"/>
+        <w:rPr>
+          <w:rFonts w:ascii="Verdana" w:hAnsi="Verdana"/>
+          <w:sz w:val="20"/>
+          <w:szCs w:val="20"/>
+        </w:rPr>
+      </w:pPr>
+      <w:r>
+        <w:rPr>
+          <w:rFonts w:ascii="Verdana" w:hAnsi="Verdana"/>
+          <w:sz w:val="20"/>
+          <w:szCs w:val="20"/>
+        </w:rPr>
+        <w:t xml:space="preserve">* </w:t>
+      </w:r>
+      <w:proofErr w:type="spellStart"/>
+      <w:proofErr w:type="gramStart"/>
+      <w:r>
+        <w:rPr>
+          <w:rFonts w:ascii="Verdana" w:hAnsi="Verdana"/>
+          <w:sz w:val="20"/>
+          <w:szCs w:val="20"/>
+        </w:rPr>
+        <w:t>posicionTabla</w:t>
+      </w:r>
+      <w:proofErr w:type="spellEnd"/>
+      <w:r>
+        <w:rPr>
+          <w:rFonts w:ascii="Verdana" w:hAnsi="Verdana"/>
+          <w:sz w:val="20"/>
+          <w:szCs w:val="20"/>
+        </w:rPr>
+        <w:t>(</w:t>
+      </w:r>
+      <w:proofErr w:type="gramEnd"/>
+      <w:r>
+        <w:rPr>
+          <w:rFonts w:ascii="Verdana" w:hAnsi="Verdana"/>
+          <w:sz w:val="20"/>
+          <w:szCs w:val="20"/>
+        </w:rPr>
+        <w:t>30) con {10,20,30,40} -&gt; se espera 2</w:t>
+      </w:r>
+    </w:p>
+    <w:p>
+      <w:pPr>
+        <w:spacing w:after="0" w:line="240" w:lineRule="auto"/>
+        <w:rPr>
+          <w:rFonts w:ascii="Verdana" w:hAnsi="Verdana"/>
+          <w:sz w:val="20"/>
+          <w:szCs w:val="20"/>
+        </w:rPr>
+      </w:pPr>
+      <w:r>
+        <w:rPr>
+          <w:rFonts w:ascii="Verdana" w:hAnsi="Verdana"/>
+          <w:sz w:val="20"/>
+          <w:szCs w:val="20"/>
+        </w:rPr>
+        <w:t xml:space="preserve">* </w:t>
+      </w:r>
+      <w:proofErr w:type="spellStart"/>
+      <w:proofErr w:type="gramStart"/>
+      <w:r>
+        <w:rPr>
+          <w:rFonts w:ascii="Verdana" w:hAnsi="Verdana"/>
+          <w:sz w:val="20"/>
+          <w:szCs w:val="20"/>
+        </w:rPr>
+        <w:t>posicionTabla</w:t>
+      </w:r>
+      <w:proofErr w:type="spellEnd"/>
+      <w:r>
+        <w:rPr>
+          <w:rFonts w:ascii="Verdana" w:hAnsi="Verdana"/>
+          <w:sz w:val="20"/>
+          <w:szCs w:val="20"/>
+        </w:rPr>
+        <w:t>(</w:t>
+      </w:r>
+      <w:proofErr w:type="gramEnd"/>
+      <w:r>
+        <w:rPr>
+          <w:rFonts w:ascii="Verdana" w:hAnsi="Verdana"/>
+          <w:sz w:val="20"/>
+          <w:szCs w:val="20"/>
+        </w:rPr>
+        <w:t>5) con {5,10,15} -&gt; se espera 0</w:t>
+      </w:r>
+    </w:p>
+    <w:p>
+      <w:pPr>
+        <w:spacing w:after="0" w:line="240" w:lineRule="auto"/>
+        <w:rPr>
+          <w:rFonts w:ascii="Verdana" w:hAnsi="Verdana"/>
+          <w:sz w:val="20"/>
+          <w:szCs w:val="20"/>
+        </w:rPr>
+      </w:pPr>
+    </w:p>
+    <w:p>
+      <w:pPr>
+        <w:spacing w:after="0" w:line="240" w:lineRule="auto"/>
+        <w:rPr>
+          <w:rFonts w:ascii="Verdana" w:hAnsi="Verdana"/>
+          <w:sz w:val="20"/>
+          <w:szCs w:val="20"/>
+        </w:rPr>
+      </w:pPr>
+      <w:r>
+        <w:rPr>
+          <w:rFonts w:ascii="Verdana" w:hAnsi="Verdana"/>
+          <w:sz w:val="20"/>
+          <w:szCs w:val="20"/>
+        </w:rPr>
+        <w:t>De manera negativa / error (errores controlados)</w:t>
+      </w:r>
+    </w:p>
+    <w:p>
+      <w:pPr>
+        <w:spacing w:after="0" w:line="240" w:lineRule="auto"/>
+        <w:rPr>
+          <w:rFonts w:ascii="Verdana" w:hAnsi="Verdana"/>
+          <w:sz w:val="20"/>
+          <w:szCs w:val="20"/>
+        </w:rPr>
+      </w:pPr>
+      <w:r>
+        <w:rPr>
+          <w:rFonts w:ascii="Verdana" w:hAnsi="Verdana"/>
+          <w:sz w:val="20"/>
+          <w:szCs w:val="20"/>
+        </w:rPr>
+        <w:t xml:space="preserve">X new </w:t>
+      </w:r>
+      <w:proofErr w:type="spellStart"/>
+      <w:r>
+        <w:rPr>
+          <w:rFonts w:ascii="Verdana" w:hAnsi="Verdana"/>
+          <w:sz w:val="20"/>
+          <w:szCs w:val="20"/>
+        </w:rPr>
+        <w:t>TablaEnteros</w:t>
+      </w:r>
+      <w:proofErr w:type="spellEnd"/>
+      <w:r>
+        <w:rPr>
+          <w:rFonts w:ascii="Verdana" w:hAnsi="Verdana"/>
+          <w:sz w:val="20"/>
+          <w:szCs w:val="20"/>
+        </w:rPr>
+        <w:t>(</w:t>
+      </w:r>
+      <w:proofErr w:type="spellStart"/>
+      <w:r>
+        <w:rPr>
+          <w:rFonts w:ascii="Verdana" w:hAnsi="Verdana"/>
+          <w:sz w:val="20"/>
+          <w:szCs w:val="20"/>
+        </w:rPr>
+        <w:t>null</w:t>
+      </w:r>
+      <w:proofErr w:type="spellEnd"/>
+      <w:r>
+        <w:rPr>
+          <w:rFonts w:ascii="Verdana" w:hAnsi="Verdana"/>
+          <w:sz w:val="20"/>
+          <w:szCs w:val="20"/>
+        </w:rPr>
+        <w:t xml:space="preserve">) -&gt; se espera </w:t>
+      </w:r>
+      <w:proofErr w:type="spellStart"/>
+      <w:r>
+        <w:rPr>
+          <w:rFonts w:ascii="Verdana" w:hAnsi="Verdana"/>
+          <w:sz w:val="20"/>
+          <w:szCs w:val="20"/>
         </w:rPr>
         <w:t>IllegalArgumentException</w:t>
       </w:r>
       <w:proofErr w:type="spellEnd"/>
       <w:r>
         <w:rPr>
-          <w:rFonts w:ascii="Tahoma" w:eastAsia="Times New Roman" w:hAnsi="Tahoma" w:cs="Tahoma"/>
-          <w:color w:val="2A2A2A"/>
-          <w:lang w:eastAsia="es-ES"/>
-        </w:rPr>
-        <w:t xml:space="preserve"> con el mensaje “El </w:t>
+          <w:rFonts w:ascii="Verdana" w:hAnsi="Verdana"/>
+          <w:sz w:val="20"/>
+          <w:szCs w:val="20"/>
+        </w:rPr>
+        <w:t xml:space="preserve"> con mensaje "No hay elementos"</w:t>
+      </w:r>
+    </w:p>
+    <w:p>
+      <w:pPr>
+        <w:spacing w:after="0" w:line="240" w:lineRule="auto"/>
+        <w:rPr>
+          <w:rFonts w:ascii="Verdana" w:hAnsi="Verdana"/>
+          <w:sz w:val="20"/>
+          <w:szCs w:val="20"/>
+        </w:rPr>
+      </w:pPr>
+      <w:r>
+        <w:rPr>
+          <w:rFonts w:ascii="Verdana" w:hAnsi="Verdana"/>
+          <w:sz w:val="20"/>
+          <w:szCs w:val="20"/>
+        </w:rPr>
+        <w:t xml:space="preserve">X new </w:t>
       </w:r>
       <w:proofErr w:type="spellStart"/>
-      <w:r>
-        <w:rPr>
-          <w:rFonts w:ascii="Tahoma" w:eastAsia="Times New Roman" w:hAnsi="Tahoma" w:cs="Tahoma"/>
-          <w:color w:val="2A2A2A"/>
-          <w:lang w:eastAsia="es-ES"/>
-        </w:rPr>
-        <w:t>numero</w:t>
+      <w:proofErr w:type="gramStart"/>
+      <w:r>
+        <w:rPr>
+          <w:rFonts w:ascii="Verdana" w:hAnsi="Verdana"/>
+          <w:sz w:val="20"/>
+          <w:szCs w:val="20"/>
+        </w:rPr>
+        <w:t>TablaEnteros</w:t>
       </w:r>
       <w:proofErr w:type="spellEnd"/>
       <w:r>
         <w:rPr>
-          <w:rFonts w:ascii="Tahoma" w:eastAsia="Times New Roman" w:hAnsi="Tahoma" w:cs="Tahoma"/>
-          <w:color w:val="2A2A2A"/>
-          <w:lang w:eastAsia="es-ES"/>
-        </w:rPr>
-        <w:t xml:space="preserve"> no puede ser negativo o 0”. Si el valor del </w:t>
-      </w:r>
+          <w:rFonts w:ascii="Verdana" w:hAnsi="Verdana"/>
+          <w:sz w:val="20"/>
+          <w:szCs w:val="20"/>
+        </w:rPr>
+        <w:t>(</w:t>
+      </w:r>
+      <w:proofErr w:type="gramEnd"/>
+      <w:r>
+        <w:rPr>
+          <w:rFonts w:ascii="Verdana" w:hAnsi="Verdana"/>
+          <w:sz w:val="20"/>
+          <w:szCs w:val="20"/>
+        </w:rPr>
+        <w:t xml:space="preserve">new </w:t>
+      </w:r>
+      <w:proofErr w:type="spellStart"/>
       <w:proofErr w:type="gramStart"/>
       <w:r>
         <w:rPr>
-          <w:rFonts w:ascii="Tahoma" w:eastAsia="Times New Roman" w:hAnsi="Tahoma" w:cs="Tahoma"/>
-          <w:color w:val="2A2A2A"/>
-          <w:lang w:eastAsia="es-ES"/>
-        </w:rPr>
-        <w:t>factorial calculado</w:t>
+          <w:rFonts w:ascii="Verdana" w:hAnsi="Verdana"/>
+          <w:sz w:val="20"/>
+          <w:szCs w:val="20"/>
+        </w:rPr>
+        <w:t>Integer</w:t>
+      </w:r>
+      <w:proofErr w:type="spellEnd"/>
+      <w:r>
+        <w:rPr>
+          <w:rFonts w:ascii="Verdana" w:hAnsi="Verdana"/>
+          <w:sz w:val="20"/>
+          <w:szCs w:val="20"/>
+        </w:rPr>
+        <w:t>[</w:t>
       </w:r>
       <w:proofErr w:type="gramEnd"/>
       <w:r>
         <w:rPr>
-          <w:rFonts w:ascii="Tahoma" w:eastAsia="Times New Roman" w:hAnsi="Tahoma" w:cs="Tahoma"/>
-          <w:color w:val="2A2A2A"/>
-          <w:lang w:eastAsia="es-ES"/>
-        </w:rPr>
-        <w:t xml:space="preserve"> es menor que 0 es que ha ocurrido un error de desbordamiento, en este caso se lanza la excepción </w:t>
+          <w:rFonts w:ascii="Verdana" w:hAnsi="Verdana"/>
+          <w:sz w:val="20"/>
+          <w:szCs w:val="20"/>
+        </w:rPr>
+        <w:t xml:space="preserve">0]) -&gt; se espera </w:t>
       </w:r>
       <w:proofErr w:type="spellStart"/>
       <w:r>
         <w:rPr>
-          <w:rFonts w:ascii="Tahoma" w:eastAsia="Times New Roman" w:hAnsi="Tahoma" w:cs="Tahoma"/>
-          <w:color w:val="2A2A2A"/>
-          <w:lang w:eastAsia="es-ES"/>
-        </w:rPr>
-        <w:t>ArithmeticException</w:t>
+          <w:rFonts w:ascii="Verdana" w:hAnsi="Verdana"/>
+          <w:sz w:val="20"/>
+          <w:szCs w:val="20"/>
+        </w:rPr>
+        <w:t>IllegalArgumentException</w:t>
       </w:r>
       <w:proofErr w:type="spellEnd"/>
       <w:r>
         <w:rPr>
-          <w:rFonts w:ascii="Tahoma" w:eastAsia="Times New Roman" w:hAnsi="Tahoma" w:cs="Tahoma"/>
-          <w:color w:val="2A2A2A"/>
-          <w:lang w:eastAsia="es-ES"/>
-        </w:rPr>
-        <w:t xml:space="preserve"> y se lanza el mensaje “</w:t>
+          <w:rFonts w:ascii="Verdana" w:hAnsi="Verdana"/>
+          <w:sz w:val="20"/>
+          <w:szCs w:val="20"/>
+        </w:rPr>
+        <w:t xml:space="preserve"> con mensaje "No hay elementos"</w:t>
+      </w:r>
+    </w:p>
+    <w:p>
+      <w:pPr>
+        <w:spacing w:after="0" w:line="240" w:lineRule="auto"/>
+        <w:rPr>
+          <w:rFonts w:ascii="Verdana" w:hAnsi="Verdana"/>
+          <w:sz w:val="20"/>
+          <w:szCs w:val="20"/>
+        </w:rPr>
+      </w:pPr>
+      <w:r>
+        <w:rPr>
+          <w:rFonts w:ascii="Verdana" w:hAnsi="Verdana"/>
+          <w:sz w:val="20"/>
+          <w:szCs w:val="20"/>
+        </w:rPr>
+        <w:t xml:space="preserve">X </w:t>
       </w:r>
       <w:proofErr w:type="spellStart"/>
-      <w:r>
-        <w:rPr>
-          <w:rFonts w:ascii="Tahoma" w:eastAsia="Times New Roman" w:hAnsi="Tahoma" w:cs="Tahoma"/>
-          <w:color w:val="2A2A2A"/>
-          <w:lang w:eastAsia="es-ES"/>
-        </w:rPr>
-        <w:t>Overflow</w:t>
+      <w:proofErr w:type="gramStart"/>
+      <w:r>
+        <w:rPr>
+          <w:rFonts w:ascii="Verdana" w:hAnsi="Verdana"/>
+          <w:sz w:val="20"/>
+          <w:szCs w:val="20"/>
+        </w:rPr>
+        <w:t>posicionTabla</w:t>
       </w:r>
       <w:proofErr w:type="spellEnd"/>
       <w:r>
         <w:rPr>
-          <w:rFonts w:ascii="Tahoma" w:eastAsia="Times New Roman" w:hAnsi="Tahoma" w:cs="Tahoma"/>
-          <w:color w:val="2A2A2A"/>
-          <w:lang w:eastAsia="es-ES"/>
-        </w:rPr>
-        <w:t>”. La clase a probar es la siguiente:</w:t>
-      </w:r>
-    </w:p>
-    <w:p>
-      <w:pPr>
-        <w:pStyle w:val="Prrafodelista"/>
-        <w:rPr>
-          <w:rFonts w:ascii="Verdana" w:hAnsi="Verdana"/>
-          <w:sz w:val="20"/>
-          <w:szCs w:val="20"/>
-        </w:rPr>
-      </w:pPr>
+          <w:rFonts w:ascii="Verdana" w:hAnsi="Verdana"/>
+          <w:sz w:val="20"/>
+          <w:szCs w:val="20"/>
+        </w:rPr>
+        <w:t>(</w:t>
+      </w:r>
+      <w:proofErr w:type="gramEnd"/>
+      <w:r>
+        <w:rPr>
+          <w:rFonts w:ascii="Verdana" w:hAnsi="Verdana"/>
+          <w:sz w:val="20"/>
+          <w:szCs w:val="20"/>
+        </w:rPr>
+        <w:t xml:space="preserve">99) con {1,2,3} -&gt; se espera </w:t>
+      </w:r>
+      <w:proofErr w:type="spellStart"/>
+      <w:r>
+        <w:rPr>
+          <w:rFonts w:ascii="Verdana" w:hAnsi="Verdana"/>
+          <w:sz w:val="20"/>
+          <w:szCs w:val="20"/>
+        </w:rPr>
+        <w:t>NoSuchElementException</w:t>
+      </w:r>
+      <w:proofErr w:type="spellEnd"/>
+      <w:r>
+        <w:rPr>
+          <w:rFonts w:ascii="Verdana" w:hAnsi="Verdana"/>
+          <w:sz w:val="20"/>
+          <w:szCs w:val="20"/>
+        </w:rPr>
+        <w:t xml:space="preserve"> con mensaje "No existe"</w:t>
+      </w:r>
     </w:p>
     <w:p>
       <w:pPr>
@@ -1173,11 +3164,6 @@
     </w:p>
     <w:p>
       <w:pPr>
-        <w:pStyle w:val="Prrafodelista"/>
-        <w:numPr>
-          <w:ilvl w:val="0"/>
-          <w:numId w:val="1"/>
-        </w:numPr>
         <w:spacing w:after="0" w:line="240" w:lineRule="auto"/>
         <w:rPr>
           <w:rFonts w:ascii="Verdana" w:hAnsi="Verdana"/>
@@ -1185,40 +3171,14 @@
           <w:szCs w:val="20"/>
         </w:rPr>
       </w:pPr>
-      <w:r>
-        <w:rPr>
-          <w:rFonts w:ascii="Tahoma" w:eastAsia="Times New Roman" w:hAnsi="Tahoma" w:cs="Tahoma"/>
-          <w:color w:val="2A2A2A"/>
-          <w:lang w:eastAsia="es-ES"/>
-        </w:rPr>
-        <w:t xml:space="preserve">Analiza el código de la siguiente clase y desarrolla una batería de pruebas en </w:t>
-      </w:r>
-      <w:proofErr w:type="spellStart"/>
-      <w:r>
-        <w:rPr>
-          <w:rFonts w:ascii="Tahoma" w:eastAsia="Times New Roman" w:hAnsi="Tahoma" w:cs="Tahoma"/>
-          <w:color w:val="2A2A2A"/>
-          <w:lang w:eastAsia="es-ES"/>
-        </w:rPr>
-        <w:t>JUnit</w:t>
-      </w:r>
-      <w:proofErr w:type="spellEnd"/>
-      <w:r>
-        <w:rPr>
-          <w:rFonts w:ascii="Tahoma" w:eastAsia="Times New Roman" w:hAnsi="Tahoma" w:cs="Tahoma"/>
-          <w:color w:val="2A2A2A"/>
-          <w:lang w:eastAsia="es-ES"/>
-        </w:rPr>
-        <w:t xml:space="preserve"> para cada uno de los métodos y constructores.</w:t>
-      </w:r>
     </w:p>
     <w:sectPr>
-      <w:headerReference w:type="even" r:id="rId12"/>
-      <w:headerReference w:type="default" r:id="rId13"/>
-      <w:footerReference w:type="even" r:id="rId14"/>
-      <w:footerReference w:type="default" r:id="rId15"/>
-      <w:headerReference w:type="first" r:id="rId16"/>
-      <w:footerReference w:type="first" r:id="rId17"/>
+      <w:headerReference w:type="even" r:id="rId20"/>
+      <w:headerReference w:type="default" r:id="rId21"/>
+      <w:footerReference w:type="even" r:id="rId22"/>
+      <w:footerReference w:type="default" r:id="rId23"/>
+      <w:headerReference w:type="first" r:id="rId24"/>
+      <w:footerReference w:type="first" r:id="rId25"/>
       <w:pgSz w:w="11906" w:h="16838"/>
       <w:pgMar w:top="1417" w:right="1701" w:bottom="1417" w:left="1701" w:header="708" w:footer="708" w:gutter="0"/>
       <w:cols w:space="708"/>
@@ -1453,6 +3413,602 @@
 <file path=word/numbering.xml><?xml version="1.0" encoding="utf-8"?>
 <w:numbering xmlns:wpc="http://schemas.microsoft.com/office/word/2010/wordprocessingCanvas" xmlns:cx="http://schemas.microsoft.com/office/drawing/2014/chartex" xmlns:cx1="http://schemas.microsoft.com/office/drawing/2015/9/8/chartex" xmlns:cx2="http://schemas.microsoft.com/office/drawing/2015/10/21/chartex" xmlns:cx3="http://schemas.microsoft.com/office/drawing/2016/5/9/chartex" xmlns:cx4="http://schemas.microsoft.com/office/drawing/2016/5/10/chartex" xmlns:cx5="http://schemas.microsoft.com/office/drawing/2016/5/11/chartex" xmlns:cx6="http://schemas.microsoft.com/office/drawing/2016/5/12/chartex" xmlns:cx7="http://schemas.microsoft.com/office/drawing/2016/5/13/chartex" xmlns:cx8="http://schemas.microsoft.com/office/drawing/2016/5/14/chartex" xmlns:mc="http://schemas.openxmlformats.org/markup-compatibility/2006" xmlns:aink="http://schemas.microsoft.com/office/drawing/2016/ink" xmlns:am3d="http://schemas.microsoft.com/office/drawing/2017/model3d" xmlns:o="urn:schemas-microsoft-com:office:office" xmlns:oel="http://schemas.microsoft.com/office/2019/extlst" xmlns:r="http://schemas.openxmlformats.org/officeDocument/2006/relationships" xmlns:m="http://schemas.openxmlformats.org/officeDocument/2006/math" xmlns:v="urn:schemas-microsoft-com:vml" xmlns:wp14="http://schemas.microsoft.com/office/word/2010/wordprocessingDrawing" xmlns:wp="http://schemas.openxmlformats.org/drawingml/2006/wordprocessingDrawing" xmlns:w10="urn:schemas-microsoft-com:office:word" xmlns:w="http://schemas.openxmlformats.org/wordprocessingml/2006/main" xmlns:w14="http://schemas.microsoft.com/office/word/2010/wordml" xmlns:w15="http://schemas.microsoft.com/office/word/2012/wordml" xmlns:w16cex="http://schemas.microsoft.com/office/word/2018/wordml/cex" xmlns:w16cid="http://schemas.microsoft.com/office/word/2016/wordml/cid" xmlns:w16="http://schemas.microsoft.com/office/word/2018/wordml" xmlns:w16du="http://schemas.microsoft.com/office/word/2023/wordml/word16du" xmlns:w16sdtdh="http://schemas.microsoft.com/office/word/2020/wordml/sdtdatahash" xmlns:w16sdtfl="http://schemas.microsoft.com/office/word/2024/wordml/sdtformatlock" xmlns:w16se="http://schemas.microsoft.com/office/word/2015/wordml/symex" xmlns:wpg="http://schemas.microsoft.com/office/word/2010/wordprocessingGroup" xmlns:wpi="http://schemas.microsoft.com/office/word/2010/wordprocessingInk" xmlns:wne="http://schemas.microsoft.com/office/word/2006/wordml" xmlns:wps="http://schemas.microsoft.com/office/word/2010/wordprocessingShape" mc:Ignorable="w14 w15 w16se w16cid w16 w16cex w16sdtdh w16sdtfl w16du wp14">
   <w:abstractNum w:abstractNumId="0" w15:restartNumberingAfterBreak="0">
+    <w:nsid w:val="00D80E9C"/>
+    <w:multiLevelType w:val="multilevel"/>
+    <w:tmpl w:val="5FF8249A"/>
+    <w:lvl w:ilvl="0">
+      <w:start w:val="1"/>
+      <w:numFmt w:val="bullet"/>
+      <w:lvlText w:val=""/>
+      <w:lvlJc w:val="left"/>
+      <w:pPr>
+        <w:tabs>
+          <w:tab w:val="num" w:pos="720"/>
+        </w:tabs>
+        <w:ind w:left="720" w:hanging="360"/>
+      </w:pPr>
+      <w:rPr>
+        <w:rFonts w:ascii="Symbol" w:hAnsi="Symbol" w:hint="default"/>
+        <w:sz w:val="20"/>
+      </w:rPr>
+    </w:lvl>
+    <w:lvl w:ilvl="1" w:tentative="1">
+      <w:start w:val="1"/>
+      <w:numFmt w:val="bullet"/>
+      <w:lvlText w:val="o"/>
+      <w:lvlJc w:val="left"/>
+      <w:pPr>
+        <w:tabs>
+          <w:tab w:val="num" w:pos="1440"/>
+        </w:tabs>
+        <w:ind w:left="1440" w:hanging="360"/>
+      </w:pPr>
+      <w:rPr>
+        <w:rFonts w:ascii="Courier New" w:hAnsi="Courier New" w:hint="default"/>
+        <w:sz w:val="20"/>
+      </w:rPr>
+    </w:lvl>
+    <w:lvl w:ilvl="2" w:tentative="1">
+      <w:start w:val="1"/>
+      <w:numFmt w:val="bullet"/>
+      <w:lvlText w:val=""/>
+      <w:lvlJc w:val="left"/>
+      <w:pPr>
+        <w:tabs>
+          <w:tab w:val="num" w:pos="2160"/>
+        </w:tabs>
+        <w:ind w:left="2160" w:hanging="360"/>
+      </w:pPr>
+      <w:rPr>
+        <w:rFonts w:ascii="Wingdings" w:hAnsi="Wingdings" w:hint="default"/>
+        <w:sz w:val="20"/>
+      </w:rPr>
+    </w:lvl>
+    <w:lvl w:ilvl="3" w:tentative="1">
+      <w:start w:val="1"/>
+      <w:numFmt w:val="bullet"/>
+      <w:lvlText w:val=""/>
+      <w:lvlJc w:val="left"/>
+      <w:pPr>
+        <w:tabs>
+          <w:tab w:val="num" w:pos="2880"/>
+        </w:tabs>
+        <w:ind w:left="2880" w:hanging="360"/>
+      </w:pPr>
+      <w:rPr>
+        <w:rFonts w:ascii="Wingdings" w:hAnsi="Wingdings" w:hint="default"/>
+        <w:sz w:val="20"/>
+      </w:rPr>
+    </w:lvl>
+    <w:lvl w:ilvl="4" w:tentative="1">
+      <w:start w:val="1"/>
+      <w:numFmt w:val="bullet"/>
+      <w:lvlText w:val=""/>
+      <w:lvlJc w:val="left"/>
+      <w:pPr>
+        <w:tabs>
+          <w:tab w:val="num" w:pos="3600"/>
+        </w:tabs>
+        <w:ind w:left="3600" w:hanging="360"/>
+      </w:pPr>
+      <w:rPr>
+        <w:rFonts w:ascii="Wingdings" w:hAnsi="Wingdings" w:hint="default"/>
+        <w:sz w:val="20"/>
+      </w:rPr>
+    </w:lvl>
+    <w:lvl w:ilvl="5" w:tentative="1">
+      <w:start w:val="1"/>
+      <w:numFmt w:val="bullet"/>
+      <w:lvlText w:val=""/>
+      <w:lvlJc w:val="left"/>
+      <w:pPr>
+        <w:tabs>
+          <w:tab w:val="num" w:pos="4320"/>
+        </w:tabs>
+        <w:ind w:left="4320" w:hanging="360"/>
+      </w:pPr>
+      <w:rPr>
+        <w:rFonts w:ascii="Wingdings" w:hAnsi="Wingdings" w:hint="default"/>
+        <w:sz w:val="20"/>
+      </w:rPr>
+    </w:lvl>
+    <w:lvl w:ilvl="6" w:tentative="1">
+      <w:start w:val="1"/>
+      <w:numFmt w:val="bullet"/>
+      <w:lvlText w:val=""/>
+      <w:lvlJc w:val="left"/>
+      <w:pPr>
+        <w:tabs>
+          <w:tab w:val="num" w:pos="5040"/>
+        </w:tabs>
+        <w:ind w:left="5040" w:hanging="360"/>
+      </w:pPr>
+      <w:rPr>
+        <w:rFonts w:ascii="Wingdings" w:hAnsi="Wingdings" w:hint="default"/>
+        <w:sz w:val="20"/>
+      </w:rPr>
+    </w:lvl>
+    <w:lvl w:ilvl="7" w:tentative="1">
+      <w:start w:val="1"/>
+      <w:numFmt w:val="bullet"/>
+      <w:lvlText w:val=""/>
+      <w:lvlJc w:val="left"/>
+      <w:pPr>
+        <w:tabs>
+          <w:tab w:val="num" w:pos="5760"/>
+        </w:tabs>
+        <w:ind w:left="5760" w:hanging="360"/>
+      </w:pPr>
+      <w:rPr>
+        <w:rFonts w:ascii="Wingdings" w:hAnsi="Wingdings" w:hint="default"/>
+        <w:sz w:val="20"/>
+      </w:rPr>
+    </w:lvl>
+    <w:lvl w:ilvl="8" w:tentative="1">
+      <w:start w:val="1"/>
+      <w:numFmt w:val="bullet"/>
+      <w:lvlText w:val=""/>
+      <w:lvlJc w:val="left"/>
+      <w:pPr>
+        <w:tabs>
+          <w:tab w:val="num" w:pos="6480"/>
+        </w:tabs>
+        <w:ind w:left="6480" w:hanging="360"/>
+      </w:pPr>
+      <w:rPr>
+        <w:rFonts w:ascii="Wingdings" w:hAnsi="Wingdings" w:hint="default"/>
+        <w:sz w:val="20"/>
+      </w:rPr>
+    </w:lvl>
+  </w:abstractNum>
+  <w:abstractNum w:abstractNumId="1" w15:restartNumberingAfterBreak="0">
+    <w:nsid w:val="06994EAC"/>
+    <w:multiLevelType w:val="multilevel"/>
+    <w:tmpl w:val="AC0E3BA2"/>
+    <w:lvl w:ilvl="0">
+      <w:start w:val="1"/>
+      <w:numFmt w:val="bullet"/>
+      <w:lvlText w:val=""/>
+      <w:lvlJc w:val="left"/>
+      <w:pPr>
+        <w:tabs>
+          <w:tab w:val="num" w:pos="720"/>
+        </w:tabs>
+        <w:ind w:left="720" w:hanging="360"/>
+      </w:pPr>
+      <w:rPr>
+        <w:rFonts w:ascii="Symbol" w:hAnsi="Symbol" w:hint="default"/>
+        <w:sz w:val="20"/>
+      </w:rPr>
+    </w:lvl>
+    <w:lvl w:ilvl="1" w:tentative="1">
+      <w:start w:val="1"/>
+      <w:numFmt w:val="bullet"/>
+      <w:lvlText w:val="o"/>
+      <w:lvlJc w:val="left"/>
+      <w:pPr>
+        <w:tabs>
+          <w:tab w:val="num" w:pos="1440"/>
+        </w:tabs>
+        <w:ind w:left="1440" w:hanging="360"/>
+      </w:pPr>
+      <w:rPr>
+        <w:rFonts w:ascii="Courier New" w:hAnsi="Courier New" w:hint="default"/>
+        <w:sz w:val="20"/>
+      </w:rPr>
+    </w:lvl>
+    <w:lvl w:ilvl="2" w:tentative="1">
+      <w:start w:val="1"/>
+      <w:numFmt w:val="bullet"/>
+      <w:lvlText w:val=""/>
+      <w:lvlJc w:val="left"/>
+      <w:pPr>
+        <w:tabs>
+          <w:tab w:val="num" w:pos="2160"/>
+        </w:tabs>
+        <w:ind w:left="2160" w:hanging="360"/>
+      </w:pPr>
+      <w:rPr>
+        <w:rFonts w:ascii="Wingdings" w:hAnsi="Wingdings" w:hint="default"/>
+        <w:sz w:val="20"/>
+      </w:rPr>
+    </w:lvl>
+    <w:lvl w:ilvl="3" w:tentative="1">
+      <w:start w:val="1"/>
+      <w:numFmt w:val="bullet"/>
+      <w:lvlText w:val=""/>
+      <w:lvlJc w:val="left"/>
+      <w:pPr>
+        <w:tabs>
+          <w:tab w:val="num" w:pos="2880"/>
+        </w:tabs>
+        <w:ind w:left="2880" w:hanging="360"/>
+      </w:pPr>
+      <w:rPr>
+        <w:rFonts w:ascii="Wingdings" w:hAnsi="Wingdings" w:hint="default"/>
+        <w:sz w:val="20"/>
+      </w:rPr>
+    </w:lvl>
+    <w:lvl w:ilvl="4" w:tentative="1">
+      <w:start w:val="1"/>
+      <w:numFmt w:val="bullet"/>
+      <w:lvlText w:val=""/>
+      <w:lvlJc w:val="left"/>
+      <w:pPr>
+        <w:tabs>
+          <w:tab w:val="num" w:pos="3600"/>
+        </w:tabs>
+        <w:ind w:left="3600" w:hanging="360"/>
+      </w:pPr>
+      <w:rPr>
+        <w:rFonts w:ascii="Wingdings" w:hAnsi="Wingdings" w:hint="default"/>
+        <w:sz w:val="20"/>
+      </w:rPr>
+    </w:lvl>
+    <w:lvl w:ilvl="5" w:tentative="1">
+      <w:start w:val="1"/>
+      <w:numFmt w:val="bullet"/>
+      <w:lvlText w:val=""/>
+      <w:lvlJc w:val="left"/>
+      <w:pPr>
+        <w:tabs>
+          <w:tab w:val="num" w:pos="4320"/>
+        </w:tabs>
+        <w:ind w:left="4320" w:hanging="360"/>
+      </w:pPr>
+      <w:rPr>
+        <w:rFonts w:ascii="Wingdings" w:hAnsi="Wingdings" w:hint="default"/>
+        <w:sz w:val="20"/>
+      </w:rPr>
+    </w:lvl>
+    <w:lvl w:ilvl="6" w:tentative="1">
+      <w:start w:val="1"/>
+      <w:numFmt w:val="bullet"/>
+      <w:lvlText w:val=""/>
+      <w:lvlJc w:val="left"/>
+      <w:pPr>
+        <w:tabs>
+          <w:tab w:val="num" w:pos="5040"/>
+        </w:tabs>
+        <w:ind w:left="5040" w:hanging="360"/>
+      </w:pPr>
+      <w:rPr>
+        <w:rFonts w:ascii="Wingdings" w:hAnsi="Wingdings" w:hint="default"/>
+        <w:sz w:val="20"/>
+      </w:rPr>
+    </w:lvl>
+    <w:lvl w:ilvl="7" w:tentative="1">
+      <w:start w:val="1"/>
+      <w:numFmt w:val="bullet"/>
+      <w:lvlText w:val=""/>
+      <w:lvlJc w:val="left"/>
+      <w:pPr>
+        <w:tabs>
+          <w:tab w:val="num" w:pos="5760"/>
+        </w:tabs>
+        <w:ind w:left="5760" w:hanging="360"/>
+      </w:pPr>
+      <w:rPr>
+        <w:rFonts w:ascii="Wingdings" w:hAnsi="Wingdings" w:hint="default"/>
+        <w:sz w:val="20"/>
+      </w:rPr>
+    </w:lvl>
+    <w:lvl w:ilvl="8" w:tentative="1">
+      <w:start w:val="1"/>
+      <w:numFmt w:val="bullet"/>
+      <w:lvlText w:val=""/>
+      <w:lvlJc w:val="left"/>
+      <w:pPr>
+        <w:tabs>
+          <w:tab w:val="num" w:pos="6480"/>
+        </w:tabs>
+        <w:ind w:left="6480" w:hanging="360"/>
+      </w:pPr>
+      <w:rPr>
+        <w:rFonts w:ascii="Wingdings" w:hAnsi="Wingdings" w:hint="default"/>
+        <w:sz w:val="20"/>
+      </w:rPr>
+    </w:lvl>
+  </w:abstractNum>
+  <w:abstractNum w:abstractNumId="2" w15:restartNumberingAfterBreak="0">
+    <w:nsid w:val="32B62734"/>
+    <w:multiLevelType w:val="multilevel"/>
+    <w:tmpl w:val="47D402CA"/>
+    <w:lvl w:ilvl="0">
+      <w:start w:val="1"/>
+      <w:numFmt w:val="bullet"/>
+      <w:lvlText w:val=""/>
+      <w:lvlJc w:val="left"/>
+      <w:pPr>
+        <w:tabs>
+          <w:tab w:val="num" w:pos="720"/>
+        </w:tabs>
+        <w:ind w:left="720" w:hanging="360"/>
+      </w:pPr>
+      <w:rPr>
+        <w:rFonts w:ascii="Symbol" w:hAnsi="Symbol" w:hint="default"/>
+        <w:sz w:val="20"/>
+      </w:rPr>
+    </w:lvl>
+    <w:lvl w:ilvl="1" w:tentative="1">
+      <w:start w:val="1"/>
+      <w:numFmt w:val="bullet"/>
+      <w:lvlText w:val="o"/>
+      <w:lvlJc w:val="left"/>
+      <w:pPr>
+        <w:tabs>
+          <w:tab w:val="num" w:pos="1440"/>
+        </w:tabs>
+        <w:ind w:left="1440" w:hanging="360"/>
+      </w:pPr>
+      <w:rPr>
+        <w:rFonts w:ascii="Courier New" w:hAnsi="Courier New" w:hint="default"/>
+        <w:sz w:val="20"/>
+      </w:rPr>
+    </w:lvl>
+    <w:lvl w:ilvl="2" w:tentative="1">
+      <w:start w:val="1"/>
+      <w:numFmt w:val="bullet"/>
+      <w:lvlText w:val=""/>
+      <w:lvlJc w:val="left"/>
+      <w:pPr>
+        <w:tabs>
+          <w:tab w:val="num" w:pos="2160"/>
+        </w:tabs>
+        <w:ind w:left="2160" w:hanging="360"/>
+      </w:pPr>
+      <w:rPr>
+        <w:rFonts w:ascii="Wingdings" w:hAnsi="Wingdings" w:hint="default"/>
+        <w:sz w:val="20"/>
+      </w:rPr>
+    </w:lvl>
+    <w:lvl w:ilvl="3" w:tentative="1">
+      <w:start w:val="1"/>
+      <w:numFmt w:val="bullet"/>
+      <w:lvlText w:val=""/>
+      <w:lvlJc w:val="left"/>
+      <w:pPr>
+        <w:tabs>
+          <w:tab w:val="num" w:pos="2880"/>
+        </w:tabs>
+        <w:ind w:left="2880" w:hanging="360"/>
+      </w:pPr>
+      <w:rPr>
+        <w:rFonts w:ascii="Wingdings" w:hAnsi="Wingdings" w:hint="default"/>
+        <w:sz w:val="20"/>
+      </w:rPr>
+    </w:lvl>
+    <w:lvl w:ilvl="4" w:tentative="1">
+      <w:start w:val="1"/>
+      <w:numFmt w:val="bullet"/>
+      <w:lvlText w:val=""/>
+      <w:lvlJc w:val="left"/>
+      <w:pPr>
+        <w:tabs>
+          <w:tab w:val="num" w:pos="3600"/>
+        </w:tabs>
+        <w:ind w:left="3600" w:hanging="360"/>
+      </w:pPr>
+      <w:rPr>
+        <w:rFonts w:ascii="Wingdings" w:hAnsi="Wingdings" w:hint="default"/>
+        <w:sz w:val="20"/>
+      </w:rPr>
+    </w:lvl>
+    <w:lvl w:ilvl="5" w:tentative="1">
+      <w:start w:val="1"/>
+      <w:numFmt w:val="bullet"/>
+      <w:lvlText w:val=""/>
+      <w:lvlJc w:val="left"/>
+      <w:pPr>
+        <w:tabs>
+          <w:tab w:val="num" w:pos="4320"/>
+        </w:tabs>
+        <w:ind w:left="4320" w:hanging="360"/>
+      </w:pPr>
+      <w:rPr>
+        <w:rFonts w:ascii="Wingdings" w:hAnsi="Wingdings" w:hint="default"/>
+        <w:sz w:val="20"/>
+      </w:rPr>
+    </w:lvl>
+    <w:lvl w:ilvl="6" w:tentative="1">
+      <w:start w:val="1"/>
+      <w:numFmt w:val="bullet"/>
+      <w:lvlText w:val=""/>
+      <w:lvlJc w:val="left"/>
+      <w:pPr>
+        <w:tabs>
+          <w:tab w:val="num" w:pos="5040"/>
+        </w:tabs>
+        <w:ind w:left="5040" w:hanging="360"/>
+      </w:pPr>
+      <w:rPr>
+        <w:rFonts w:ascii="Wingdings" w:hAnsi="Wingdings" w:hint="default"/>
+        <w:sz w:val="20"/>
+      </w:rPr>
+    </w:lvl>
+    <w:lvl w:ilvl="7" w:tentative="1">
+      <w:start w:val="1"/>
+      <w:numFmt w:val="bullet"/>
+      <w:lvlText w:val=""/>
+      <w:lvlJc w:val="left"/>
+      <w:pPr>
+        <w:tabs>
+          <w:tab w:val="num" w:pos="5760"/>
+        </w:tabs>
+        <w:ind w:left="5760" w:hanging="360"/>
+      </w:pPr>
+      <w:rPr>
+        <w:rFonts w:ascii="Wingdings" w:hAnsi="Wingdings" w:hint="default"/>
+        <w:sz w:val="20"/>
+      </w:rPr>
+    </w:lvl>
+    <w:lvl w:ilvl="8" w:tentative="1">
+      <w:start w:val="1"/>
+      <w:numFmt w:val="bullet"/>
+      <w:lvlText w:val=""/>
+      <w:lvlJc w:val="left"/>
+      <w:pPr>
+        <w:tabs>
+          <w:tab w:val="num" w:pos="6480"/>
+        </w:tabs>
+        <w:ind w:left="6480" w:hanging="360"/>
+      </w:pPr>
+      <w:rPr>
+        <w:rFonts w:ascii="Wingdings" w:hAnsi="Wingdings" w:hint="default"/>
+        <w:sz w:val="20"/>
+      </w:rPr>
+    </w:lvl>
+  </w:abstractNum>
+  <w:abstractNum w:abstractNumId="3" w15:restartNumberingAfterBreak="0">
+    <w:nsid w:val="440A0797"/>
+    <w:multiLevelType w:val="multilevel"/>
+    <w:tmpl w:val="B09CCC38"/>
+    <w:lvl w:ilvl="0">
+      <w:start w:val="1"/>
+      <w:numFmt w:val="bullet"/>
+      <w:lvlText w:val=""/>
+      <w:lvlJc w:val="left"/>
+      <w:pPr>
+        <w:tabs>
+          <w:tab w:val="num" w:pos="720"/>
+        </w:tabs>
+        <w:ind w:left="720" w:hanging="360"/>
+      </w:pPr>
+      <w:rPr>
+        <w:rFonts w:ascii="Symbol" w:hAnsi="Symbol" w:hint="default"/>
+        <w:sz w:val="20"/>
+      </w:rPr>
+    </w:lvl>
+    <w:lvl w:ilvl="1" w:tentative="1">
+      <w:start w:val="1"/>
+      <w:numFmt w:val="bullet"/>
+      <w:lvlText w:val="o"/>
+      <w:lvlJc w:val="left"/>
+      <w:pPr>
+        <w:tabs>
+          <w:tab w:val="num" w:pos="1440"/>
+        </w:tabs>
+        <w:ind w:left="1440" w:hanging="360"/>
+      </w:pPr>
+      <w:rPr>
+        <w:rFonts w:ascii="Courier New" w:hAnsi="Courier New" w:hint="default"/>
+        <w:sz w:val="20"/>
+      </w:rPr>
+    </w:lvl>
+    <w:lvl w:ilvl="2" w:tentative="1">
+      <w:start w:val="1"/>
+      <w:numFmt w:val="bullet"/>
+      <w:lvlText w:val=""/>
+      <w:lvlJc w:val="left"/>
+      <w:pPr>
+        <w:tabs>
+          <w:tab w:val="num" w:pos="2160"/>
+        </w:tabs>
+        <w:ind w:left="2160" w:hanging="360"/>
+      </w:pPr>
+      <w:rPr>
+        <w:rFonts w:ascii="Wingdings" w:hAnsi="Wingdings" w:hint="default"/>
+        <w:sz w:val="20"/>
+      </w:rPr>
+    </w:lvl>
+    <w:lvl w:ilvl="3" w:tentative="1">
+      <w:start w:val="1"/>
+      <w:numFmt w:val="bullet"/>
+      <w:lvlText w:val=""/>
+      <w:lvlJc w:val="left"/>
+      <w:pPr>
+        <w:tabs>
+          <w:tab w:val="num" w:pos="2880"/>
+        </w:tabs>
+        <w:ind w:left="2880" w:hanging="360"/>
+      </w:pPr>
+      <w:rPr>
+        <w:rFonts w:ascii="Wingdings" w:hAnsi="Wingdings" w:hint="default"/>
+        <w:sz w:val="20"/>
+      </w:rPr>
+    </w:lvl>
+    <w:lvl w:ilvl="4" w:tentative="1">
+      <w:start w:val="1"/>
+      <w:numFmt w:val="bullet"/>
+      <w:lvlText w:val=""/>
+      <w:lvlJc w:val="left"/>
+      <w:pPr>
+        <w:tabs>
+          <w:tab w:val="num" w:pos="3600"/>
+        </w:tabs>
+        <w:ind w:left="3600" w:hanging="360"/>
+      </w:pPr>
+      <w:rPr>
+        <w:rFonts w:ascii="Wingdings" w:hAnsi="Wingdings" w:hint="default"/>
+        <w:sz w:val="20"/>
+      </w:rPr>
+    </w:lvl>
+    <w:lvl w:ilvl="5" w:tentative="1">
+      <w:start w:val="1"/>
+      <w:numFmt w:val="bullet"/>
+      <w:lvlText w:val=""/>
+      <w:lvlJc w:val="left"/>
+      <w:pPr>
+        <w:tabs>
+          <w:tab w:val="num" w:pos="4320"/>
+        </w:tabs>
+        <w:ind w:left="4320" w:hanging="360"/>
+      </w:pPr>
+      <w:rPr>
+        <w:rFonts w:ascii="Wingdings" w:hAnsi="Wingdings" w:hint="default"/>
+        <w:sz w:val="20"/>
+      </w:rPr>
+    </w:lvl>
+    <w:lvl w:ilvl="6" w:tentative="1">
+      <w:start w:val="1"/>
+      <w:numFmt w:val="bullet"/>
+      <w:lvlText w:val=""/>
+      <w:lvlJc w:val="left"/>
+      <w:pPr>
+        <w:tabs>
+          <w:tab w:val="num" w:pos="5040"/>
+        </w:tabs>
+        <w:ind w:left="5040" w:hanging="360"/>
+      </w:pPr>
+      <w:rPr>
+        <w:rFonts w:ascii="Wingdings" w:hAnsi="Wingdings" w:hint="default"/>
+        <w:sz w:val="20"/>
+      </w:rPr>
+    </w:lvl>
+    <w:lvl w:ilvl="7" w:tentative="1">
+      <w:start w:val="1"/>
+      <w:numFmt w:val="bullet"/>
+      <w:lvlText w:val=""/>
+      <w:lvlJc w:val="left"/>
+      <w:pPr>
+        <w:tabs>
+          <w:tab w:val="num" w:pos="5760"/>
+        </w:tabs>
+        <w:ind w:left="5760" w:hanging="360"/>
+      </w:pPr>
+      <w:rPr>
+        <w:rFonts w:ascii="Wingdings" w:hAnsi="Wingdings" w:hint="default"/>
+        <w:sz w:val="20"/>
+      </w:rPr>
+    </w:lvl>
+    <w:lvl w:ilvl="8" w:tentative="1">
+      <w:start w:val="1"/>
+      <w:numFmt w:val="bullet"/>
+      <w:lvlText w:val=""/>
+      <w:lvlJc w:val="left"/>
+      <w:pPr>
+        <w:tabs>
+          <w:tab w:val="num" w:pos="6480"/>
+        </w:tabs>
+        <w:ind w:left="6480" w:hanging="360"/>
+      </w:pPr>
+      <w:rPr>
+        <w:rFonts w:ascii="Wingdings" w:hAnsi="Wingdings" w:hint="default"/>
+        <w:sz w:val="20"/>
+      </w:rPr>
+    </w:lvl>
+  </w:abstractNum>
+  <w:abstractNum w:abstractNumId="4" w15:restartNumberingAfterBreak="0">
     <w:nsid w:val="6EEA4A3E"/>
     <w:multiLevelType w:val="hybridMultilevel"/>
     <w:tmpl w:val="A754B9A6"/>
@@ -1541,7 +4097,7 @@
       </w:pPr>
     </w:lvl>
   </w:abstractNum>
-  <w:abstractNum w:abstractNumId="1" w15:restartNumberingAfterBreak="0">
+  <w:abstractNum w:abstractNumId="5" w15:restartNumberingAfterBreak="0">
     <w:nsid w:val="70111927"/>
     <w:multiLevelType w:val="hybridMultilevel"/>
     <w:tmpl w:val="A754B9A6"/>
@@ -1630,7 +4186,156 @@
       </w:pPr>
     </w:lvl>
   </w:abstractNum>
-  <w:abstractNum w:abstractNumId="2" w15:restartNumberingAfterBreak="0">
+  <w:abstractNum w:abstractNumId="6" w15:restartNumberingAfterBreak="0">
+    <w:nsid w:val="73E86182"/>
+    <w:multiLevelType w:val="multilevel"/>
+    <w:tmpl w:val="19E495CE"/>
+    <w:lvl w:ilvl="0">
+      <w:start w:val="1"/>
+      <w:numFmt w:val="bullet"/>
+      <w:lvlText w:val=""/>
+      <w:lvlJc w:val="left"/>
+      <w:pPr>
+        <w:tabs>
+          <w:tab w:val="num" w:pos="720"/>
+        </w:tabs>
+        <w:ind w:left="720" w:hanging="360"/>
+      </w:pPr>
+      <w:rPr>
+        <w:rFonts w:ascii="Symbol" w:hAnsi="Symbol" w:hint="default"/>
+        <w:sz w:val="20"/>
+      </w:rPr>
+    </w:lvl>
+    <w:lvl w:ilvl="1" w:tentative="1">
+      <w:start w:val="1"/>
+      <w:numFmt w:val="bullet"/>
+      <w:lvlText w:val="o"/>
+      <w:lvlJc w:val="left"/>
+      <w:pPr>
+        <w:tabs>
+          <w:tab w:val="num" w:pos="1440"/>
+        </w:tabs>
+        <w:ind w:left="1440" w:hanging="360"/>
+      </w:pPr>
+      <w:rPr>
+        <w:rFonts w:ascii="Courier New" w:hAnsi="Courier New" w:hint="default"/>
+        <w:sz w:val="20"/>
+      </w:rPr>
+    </w:lvl>
+    <w:lvl w:ilvl="2" w:tentative="1">
+      <w:start w:val="1"/>
+      <w:numFmt w:val="bullet"/>
+      <w:lvlText w:val=""/>
+      <w:lvlJc w:val="left"/>
+      <w:pPr>
+        <w:tabs>
+          <w:tab w:val="num" w:pos="2160"/>
+        </w:tabs>
+        <w:ind w:left="2160" w:hanging="360"/>
+      </w:pPr>
+      <w:rPr>
+        <w:rFonts w:ascii="Wingdings" w:hAnsi="Wingdings" w:hint="default"/>
+        <w:sz w:val="20"/>
+      </w:rPr>
+    </w:lvl>
+    <w:lvl w:ilvl="3" w:tentative="1">
+      <w:start w:val="1"/>
+      <w:numFmt w:val="bullet"/>
+      <w:lvlText w:val=""/>
+      <w:lvlJc w:val="left"/>
+      <w:pPr>
+        <w:tabs>
+          <w:tab w:val="num" w:pos="2880"/>
+        </w:tabs>
+        <w:ind w:left="2880" w:hanging="360"/>
+      </w:pPr>
+      <w:rPr>
+        <w:rFonts w:ascii="Wingdings" w:hAnsi="Wingdings" w:hint="default"/>
+        <w:sz w:val="20"/>
+      </w:rPr>
+    </w:lvl>
+    <w:lvl w:ilvl="4" w:tentative="1">
+      <w:start w:val="1"/>
+      <w:numFmt w:val="bullet"/>
+      <w:lvlText w:val=""/>
+      <w:lvlJc w:val="left"/>
+      <w:pPr>
+        <w:tabs>
+          <w:tab w:val="num" w:pos="3600"/>
+        </w:tabs>
+        <w:ind w:left="3600" w:hanging="360"/>
+      </w:pPr>
+      <w:rPr>
+        <w:rFonts w:ascii="Wingdings" w:hAnsi="Wingdings" w:hint="default"/>
+        <w:sz w:val="20"/>
+      </w:rPr>
+    </w:lvl>
+    <w:lvl w:ilvl="5" w:tentative="1">
+      <w:start w:val="1"/>
+      <w:numFmt w:val="bullet"/>
+      <w:lvlText w:val=""/>
+      <w:lvlJc w:val="left"/>
+      <w:pPr>
+        <w:tabs>
+          <w:tab w:val="num" w:pos="4320"/>
+        </w:tabs>
+        <w:ind w:left="4320" w:hanging="360"/>
+      </w:pPr>
+      <w:rPr>
+        <w:rFonts w:ascii="Wingdings" w:hAnsi="Wingdings" w:hint="default"/>
+        <w:sz w:val="20"/>
+      </w:rPr>
+    </w:lvl>
+    <w:lvl w:ilvl="6" w:tentative="1">
+      <w:start w:val="1"/>
+      <w:numFmt w:val="bullet"/>
+      <w:lvlText w:val=""/>
+      <w:lvlJc w:val="left"/>
+      <w:pPr>
+        <w:tabs>
+          <w:tab w:val="num" w:pos="5040"/>
+        </w:tabs>
+        <w:ind w:left="5040" w:hanging="360"/>
+      </w:pPr>
+      <w:rPr>
+        <w:rFonts w:ascii="Wingdings" w:hAnsi="Wingdings" w:hint="default"/>
+        <w:sz w:val="20"/>
+      </w:rPr>
+    </w:lvl>
+    <w:lvl w:ilvl="7" w:tentative="1">
+      <w:start w:val="1"/>
+      <w:numFmt w:val="bullet"/>
+      <w:lvlText w:val=""/>
+      <w:lvlJc w:val="left"/>
+      <w:pPr>
+        <w:tabs>
+          <w:tab w:val="num" w:pos="5760"/>
+        </w:tabs>
+        <w:ind w:left="5760" w:hanging="360"/>
+      </w:pPr>
+      <w:rPr>
+        <w:rFonts w:ascii="Wingdings" w:hAnsi="Wingdings" w:hint="default"/>
+        <w:sz w:val="20"/>
+      </w:rPr>
+    </w:lvl>
+    <w:lvl w:ilvl="8" w:tentative="1">
+      <w:start w:val="1"/>
+      <w:numFmt w:val="bullet"/>
+      <w:lvlText w:val=""/>
+      <w:lvlJc w:val="left"/>
+      <w:pPr>
+        <w:tabs>
+          <w:tab w:val="num" w:pos="6480"/>
+        </w:tabs>
+        <w:ind w:left="6480" w:hanging="360"/>
+      </w:pPr>
+      <w:rPr>
+        <w:rFonts w:ascii="Wingdings" w:hAnsi="Wingdings" w:hint="default"/>
+        <w:sz w:val="20"/>
+      </w:rPr>
+    </w:lvl>
+  </w:abstractNum>
+  <w:abstractNum w:abstractNumId="7" w15:restartNumberingAfterBreak="0">
     <w:nsid w:val="740E09F1"/>
     <w:multiLevelType w:val="hybridMultilevel"/>
     <w:tmpl w:val="A754B9A6"/>
@@ -1719,14 +4424,181 @@
       </w:pPr>
     </w:lvl>
   </w:abstractNum>
+  <w:abstractNum w:abstractNumId="8" w15:restartNumberingAfterBreak="0">
+    <w:nsid w:val="79AD3FAB"/>
+    <w:multiLevelType w:val="multilevel"/>
+    <w:tmpl w:val="99A2562C"/>
+    <w:lvl w:ilvl="0">
+      <w:start w:val="1"/>
+      <w:numFmt w:val="bullet"/>
+      <w:lvlText w:val=""/>
+      <w:lvlJc w:val="left"/>
+      <w:pPr>
+        <w:tabs>
+          <w:tab w:val="num" w:pos="720"/>
+        </w:tabs>
+        <w:ind w:left="720" w:hanging="360"/>
+      </w:pPr>
+      <w:rPr>
+        <w:rFonts w:ascii="Symbol" w:hAnsi="Symbol" w:hint="default"/>
+        <w:sz w:val="20"/>
+      </w:rPr>
+    </w:lvl>
+    <w:lvl w:ilvl="1" w:tentative="1">
+      <w:start w:val="1"/>
+      <w:numFmt w:val="bullet"/>
+      <w:lvlText w:val="o"/>
+      <w:lvlJc w:val="left"/>
+      <w:pPr>
+        <w:tabs>
+          <w:tab w:val="num" w:pos="1440"/>
+        </w:tabs>
+        <w:ind w:left="1440" w:hanging="360"/>
+      </w:pPr>
+      <w:rPr>
+        <w:rFonts w:ascii="Courier New" w:hAnsi="Courier New" w:hint="default"/>
+        <w:sz w:val="20"/>
+      </w:rPr>
+    </w:lvl>
+    <w:lvl w:ilvl="2" w:tentative="1">
+      <w:start w:val="1"/>
+      <w:numFmt w:val="bullet"/>
+      <w:lvlText w:val=""/>
+      <w:lvlJc w:val="left"/>
+      <w:pPr>
+        <w:tabs>
+          <w:tab w:val="num" w:pos="2160"/>
+        </w:tabs>
+        <w:ind w:left="2160" w:hanging="360"/>
+      </w:pPr>
+      <w:rPr>
+        <w:rFonts w:ascii="Wingdings" w:hAnsi="Wingdings" w:hint="default"/>
+        <w:sz w:val="20"/>
+      </w:rPr>
+    </w:lvl>
+    <w:lvl w:ilvl="3" w:tentative="1">
+      <w:start w:val="1"/>
+      <w:numFmt w:val="bullet"/>
+      <w:lvlText w:val=""/>
+      <w:lvlJc w:val="left"/>
+      <w:pPr>
+        <w:tabs>
+          <w:tab w:val="num" w:pos="2880"/>
+        </w:tabs>
+        <w:ind w:left="2880" w:hanging="360"/>
+      </w:pPr>
+      <w:rPr>
+        <w:rFonts w:ascii="Wingdings" w:hAnsi="Wingdings" w:hint="default"/>
+        <w:sz w:val="20"/>
+      </w:rPr>
+    </w:lvl>
+    <w:lvl w:ilvl="4" w:tentative="1">
+      <w:start w:val="1"/>
+      <w:numFmt w:val="bullet"/>
+      <w:lvlText w:val=""/>
+      <w:lvlJc w:val="left"/>
+      <w:pPr>
+        <w:tabs>
+          <w:tab w:val="num" w:pos="3600"/>
+        </w:tabs>
+        <w:ind w:left="3600" w:hanging="360"/>
+      </w:pPr>
+      <w:rPr>
+        <w:rFonts w:ascii="Wingdings" w:hAnsi="Wingdings" w:hint="default"/>
+        <w:sz w:val="20"/>
+      </w:rPr>
+    </w:lvl>
+    <w:lvl w:ilvl="5" w:tentative="1">
+      <w:start w:val="1"/>
+      <w:numFmt w:val="bullet"/>
+      <w:lvlText w:val=""/>
+      <w:lvlJc w:val="left"/>
+      <w:pPr>
+        <w:tabs>
+          <w:tab w:val="num" w:pos="4320"/>
+        </w:tabs>
+        <w:ind w:left="4320" w:hanging="360"/>
+      </w:pPr>
+      <w:rPr>
+        <w:rFonts w:ascii="Wingdings" w:hAnsi="Wingdings" w:hint="default"/>
+        <w:sz w:val="20"/>
+      </w:rPr>
+    </w:lvl>
+    <w:lvl w:ilvl="6" w:tentative="1">
+      <w:start w:val="1"/>
+      <w:numFmt w:val="bullet"/>
+      <w:lvlText w:val=""/>
+      <w:lvlJc w:val="left"/>
+      <w:pPr>
+        <w:tabs>
+          <w:tab w:val="num" w:pos="5040"/>
+        </w:tabs>
+        <w:ind w:left="5040" w:hanging="360"/>
+      </w:pPr>
+      <w:rPr>
+        <w:rFonts w:ascii="Wingdings" w:hAnsi="Wingdings" w:hint="default"/>
+        <w:sz w:val="20"/>
+      </w:rPr>
+    </w:lvl>
+    <w:lvl w:ilvl="7" w:tentative="1">
+      <w:start w:val="1"/>
+      <w:numFmt w:val="bullet"/>
+      <w:lvlText w:val=""/>
+      <w:lvlJc w:val="left"/>
+      <w:pPr>
+        <w:tabs>
+          <w:tab w:val="num" w:pos="5760"/>
+        </w:tabs>
+        <w:ind w:left="5760" w:hanging="360"/>
+      </w:pPr>
+      <w:rPr>
+        <w:rFonts w:ascii="Wingdings" w:hAnsi="Wingdings" w:hint="default"/>
+        <w:sz w:val="20"/>
+      </w:rPr>
+    </w:lvl>
+    <w:lvl w:ilvl="8" w:tentative="1">
+      <w:start w:val="1"/>
+      <w:numFmt w:val="bullet"/>
+      <w:lvlText w:val=""/>
+      <w:lvlJc w:val="left"/>
+      <w:pPr>
+        <w:tabs>
+          <w:tab w:val="num" w:pos="6480"/>
+        </w:tabs>
+        <w:ind w:left="6480" w:hanging="360"/>
+      </w:pPr>
+      <w:rPr>
+        <w:rFonts w:ascii="Wingdings" w:hAnsi="Wingdings" w:hint="default"/>
+        <w:sz w:val="20"/>
+      </w:rPr>
+    </w:lvl>
+  </w:abstractNum>
   <w:num w:numId="1" w16cid:durableId="730617187">
+    <w:abstractNumId w:val="7"/>
+  </w:num>
+  <w:num w:numId="2" w16cid:durableId="303052255">
+    <w:abstractNumId w:val="4"/>
+  </w:num>
+  <w:num w:numId="3" w16cid:durableId="652225235">
+    <w:abstractNumId w:val="5"/>
+  </w:num>
+  <w:num w:numId="4" w16cid:durableId="5599902">
+    <w:abstractNumId w:val="3"/>
+  </w:num>
+  <w:num w:numId="5" w16cid:durableId="1113288190">
+    <w:abstractNumId w:val="6"/>
+  </w:num>
+  <w:num w:numId="6" w16cid:durableId="210777447">
+    <w:abstractNumId w:val="1"/>
+  </w:num>
+  <w:num w:numId="7" w16cid:durableId="1288052375">
+    <w:abstractNumId w:val="0"/>
+  </w:num>
+  <w:num w:numId="8" w16cid:durableId="586228350">
     <w:abstractNumId w:val="2"/>
   </w:num>
-  <w:num w:numId="2" w16cid:durableId="303052255">
-    <w:abstractNumId w:val="0"/>
-  </w:num>
-  <w:num w:numId="3" w16cid:durableId="652225235">
-    <w:abstractNumId w:val="1"/>
+  <w:num w:numId="9" w16cid:durableId="402679735">
+    <w:abstractNumId w:val="8"/>
   </w:num>
 </w:numbering>
 </file>
@@ -2173,10 +5045,32 @@
       <w:szCs w:val="26"/>
     </w:rPr>
   </w:style>
+  <w:style w:type="paragraph" w:styleId="Ttulo3">
+    <w:name w:val="heading 3"/>
+    <w:basedOn w:val="Normal"/>
+    <w:next w:val="Normal"/>
+    <w:link w:val="Ttulo3Car"/>
+    <w:uiPriority w:val="9"/>
+    <w:semiHidden/>
+    <w:unhideWhenUsed/>
+    <w:qFormat/>
+    <w:rsid w:val="00B31A76"/>
+    <w:pPr>
+      <w:keepNext/>
+      <w:keepLines/>
+      <w:spacing w:before="40" w:after="0"/>
+      <w:outlineLvl w:val="2"/>
+    </w:pPr>
+    <w:rPr>
+      <w:rFonts w:asciiTheme="majorHAnsi" w:eastAsiaTheme="majorEastAsia" w:hAnsiTheme="majorHAnsi" w:cstheme="majorBidi"/>
+      <w:color w:val="1F3763" w:themeColor="accent1" w:themeShade="7F"/>
+      <w:sz w:val="24"/>
+      <w:szCs w:val="24"/>
+    </w:rPr>
+  </w:style>
   <w:style w:type="character" w:default="1" w:styleId="Fuentedeprrafopredeter">
     <w:name w:val="Default Paragraph Font"/>
     <w:uiPriority w:val="1"/>
-    <w:semiHidden/>
     <w:unhideWhenUsed/>
   </w:style>
   <w:style w:type="table" w:default="1" w:styleId="Tablanormal">
@@ -2346,6 +5240,20 @@
       <w:ind w:left="720"/>
       <w:contextualSpacing/>
     </w:pPr>
+  </w:style>
+  <w:style w:type="character" w:customStyle="1" w:styleId="Ttulo3Car">
+    <w:name w:val="Título 3 Car"/>
+    <w:basedOn w:val="Fuentedeprrafopredeter"/>
+    <w:link w:val="Ttulo3"/>
+    <w:uiPriority w:val="9"/>
+    <w:semiHidden/>
+    <w:rsid w:val="00B31A76"/>
+    <w:rPr>
+      <w:rFonts w:asciiTheme="majorHAnsi" w:eastAsiaTheme="majorEastAsia" w:hAnsiTheme="majorHAnsi" w:cstheme="majorBidi"/>
+      <w:color w:val="1F3763" w:themeColor="accent1" w:themeShade="7F"/>
+      <w:sz w:val="24"/>
+      <w:szCs w:val="24"/>
+    </w:rPr>
   </w:style>
 </w:styles>
 </file>

</xml_diff>

<commit_message>
Tema6 empiezo el ejercicio 1
</commit_message>
<xml_diff>
--- a/Tema3/Tema3_Tarea3_LRP.docx
+++ b/Tema3/Tema3_Tarea3_LRP.docx
@@ -189,7 +189,7 @@
           <w:sz w:val="40"/>
           <w:szCs w:val="40"/>
         </w:rPr>
-        <w:t>23</w:t>
+        <w:t>30</w:t>
       </w:r>
       <w:r>
         <w:rPr>
@@ -1428,6 +1428,58 @@
           <w:lang w:eastAsia="es-ES"/>
         </w:rPr>
       </w:pPr>
+      <w:r>
+        <w:rPr>
+          <w:rFonts w:ascii="Verdana" w:eastAsia="Times New Roman" w:hAnsi="Verdana" w:cs="Tahoma"/>
+          <w:noProof/>
+          <w:color w:val="2A2A2A"/>
+          <w:sz w:val="20"/>
+          <w:szCs w:val="20"/>
+          <w:lang w:eastAsia="es-ES"/>
+        </w:rPr>
+        <w:lastRenderedPageBreak/>
+        <w:drawing>
+          <wp:inline distT="0" distB="0" distL="0" distR="0" wp14:anchorId="1C6FEBF0" wp14:editId="19E899B3">
+            <wp:extent cx="5400040" cy="1985010"/>
+            <wp:effectExtent l="0" t="0" r="0" b="0"/>
+            <wp:docPr id="1087325735" name="Imagen 1"/>
+            <wp:cNvGraphicFramePr>
+              <a:graphicFrameLocks xmlns:a="http://schemas.openxmlformats.org/drawingml/2006/main" noChangeAspect="1"/>
+            </wp:cNvGraphicFramePr>
+            <a:graphic xmlns:a="http://schemas.openxmlformats.org/drawingml/2006/main">
+              <a:graphicData uri="http://schemas.openxmlformats.org/drawingml/2006/picture">
+                <pic:pic xmlns:pic="http://schemas.openxmlformats.org/drawingml/2006/picture">
+                  <pic:nvPicPr>
+                    <pic:cNvPr id="1087325735" name=""/>
+                    <pic:cNvPicPr/>
+                  </pic:nvPicPr>
+                  <pic:blipFill>
+                    <a:blip r:embed="rId14">
+                      <a:extLst>
+                        <a:ext uri="{28A0092B-C50C-407E-A947-70E740481C1C}">
+                          <a14:useLocalDpi xmlns:a14="http://schemas.microsoft.com/office/drawing/2010/main" val="0"/>
+                        </a:ext>
+                      </a:extLst>
+                    </a:blip>
+                    <a:stretch>
+                      <a:fillRect/>
+                    </a:stretch>
+                  </pic:blipFill>
+                  <pic:spPr>
+                    <a:xfrm>
+                      <a:off x="0" y="0"/>
+                      <a:ext cx="5400040" cy="1985010"/>
+                    </a:xfrm>
+                    <a:prstGeom prst="rect">
+                      <a:avLst/>
+                    </a:prstGeom>
+                  </pic:spPr>
+                </pic:pic>
+              </a:graphicData>
+            </a:graphic>
+          </wp:inline>
+        </w:drawing>
+      </w:r>
     </w:p>
     <w:p>
       <w:pPr>
@@ -1441,7 +1493,11 @@
           <w:lang w:eastAsia="es-ES"/>
         </w:rPr>
       </w:pPr>
-      <w:r>
+    </w:p>
+    <w:p>
+      <w:pPr>
+        <w:spacing w:after="0" w:line="240" w:lineRule="auto"/>
+        <w:ind w:left="360"/>
         <w:rPr>
           <w:rFonts w:ascii="Verdana" w:eastAsia="Times New Roman" w:hAnsi="Verdana" w:cs="Tahoma"/>
           <w:color w:val="2A2A2A"/>
@@ -1449,8 +1505,7 @@
           <w:szCs w:val="20"/>
           <w:lang w:eastAsia="es-ES"/>
         </w:rPr>
-        <w:t>Para poder realizar los test de manera metódica y eficiente, u</w:t>
-      </w:r>
+      </w:pPr>
       <w:r>
         <w:rPr>
           <w:rFonts w:ascii="Verdana" w:eastAsia="Times New Roman" w:hAnsi="Verdana" w:cs="Tahoma"/>
@@ -1459,9 +1514,8 @@
           <w:szCs w:val="20"/>
           <w:lang w:eastAsia="es-ES"/>
         </w:rPr>
-        <w:t xml:space="preserve">tilizamos la ayuda </w:t>
-      </w:r>
-      <w:proofErr w:type="spellStart"/>
+        <w:t>Para poder realizar los test de manera metódica y eficiente, u</w:t>
+      </w:r>
       <w:r>
         <w:rPr>
           <w:rFonts w:ascii="Verdana" w:eastAsia="Times New Roman" w:hAnsi="Verdana" w:cs="Tahoma"/>
@@ -1470,9 +1524,9 @@
           <w:szCs w:val="20"/>
           <w:lang w:eastAsia="es-ES"/>
         </w:rPr>
-        <w:t>de el</w:t>
-      </w:r>
-      <w:proofErr w:type="spellEnd"/>
+        <w:t xml:space="preserve">tilizamos la ayuda </w:t>
+      </w:r>
+      <w:proofErr w:type="spellStart"/>
       <w:r>
         <w:rPr>
           <w:rFonts w:ascii="Verdana" w:eastAsia="Times New Roman" w:hAnsi="Verdana" w:cs="Tahoma"/>
@@ -1481,7 +1535,62 @@
           <w:szCs w:val="20"/>
           <w:lang w:eastAsia="es-ES"/>
         </w:rPr>
-        <w:t xml:space="preserve"> método de caja blanca para saber cuales serian los </w:t>
+        <w:t>de el</w:t>
+      </w:r>
+      <w:proofErr w:type="spellEnd"/>
+      <w:r>
+        <w:rPr>
+          <w:rFonts w:ascii="Verdana" w:eastAsia="Times New Roman" w:hAnsi="Verdana" w:cs="Tahoma"/>
+          <w:color w:val="2A2A2A"/>
+          <w:sz w:val="20"/>
+          <w:szCs w:val="20"/>
+          <w:lang w:eastAsia="es-ES"/>
+        </w:rPr>
+        <w:t xml:space="preserve"> método de caja blanca para saber </w:t>
+      </w:r>
+      <w:proofErr w:type="spellStart"/>
+      <w:r>
+        <w:rPr>
+          <w:rFonts w:ascii="Verdana" w:eastAsia="Times New Roman" w:hAnsi="Verdana" w:cs="Tahoma"/>
+          <w:color w:val="2A2A2A"/>
+          <w:sz w:val="20"/>
+          <w:szCs w:val="20"/>
+          <w:lang w:eastAsia="es-ES"/>
+        </w:rPr>
+        <w:t>cuales</w:t>
+      </w:r>
+      <w:proofErr w:type="spellEnd"/>
+      <w:r>
+        <w:rPr>
+          <w:rFonts w:ascii="Verdana" w:eastAsia="Times New Roman" w:hAnsi="Verdana" w:cs="Tahoma"/>
+          <w:color w:val="2A2A2A"/>
+          <w:sz w:val="20"/>
+          <w:szCs w:val="20"/>
+          <w:lang w:eastAsia="es-ES"/>
+        </w:rPr>
+        <w:t xml:space="preserve"> </w:t>
+      </w:r>
+      <w:proofErr w:type="spellStart"/>
+      <w:r>
+        <w:rPr>
+          <w:rFonts w:ascii="Verdana" w:eastAsia="Times New Roman" w:hAnsi="Verdana" w:cs="Tahoma"/>
+          <w:color w:val="2A2A2A"/>
+          <w:sz w:val="20"/>
+          <w:szCs w:val="20"/>
+          <w:lang w:eastAsia="es-ES"/>
+        </w:rPr>
+        <w:t>serian</w:t>
+      </w:r>
+      <w:proofErr w:type="spellEnd"/>
+      <w:r>
+        <w:rPr>
+          <w:rFonts w:ascii="Verdana" w:eastAsia="Times New Roman" w:hAnsi="Verdana" w:cs="Tahoma"/>
+          <w:color w:val="2A2A2A"/>
+          <w:sz w:val="20"/>
+          <w:szCs w:val="20"/>
+          <w:lang w:eastAsia="es-ES"/>
+        </w:rPr>
+        <w:t xml:space="preserve"> los </w:t>
       </w:r>
       <w:r>
         <w:rPr>
@@ -1717,7 +1826,7 @@
                     <pic:cNvPicPr/>
                   </pic:nvPicPr>
                   <pic:blipFill>
-                    <a:blip r:embed="rId14">
+                    <a:blip r:embed="rId15">
                       <a:extLst>
                         <a:ext uri="{28A0092B-C50C-407E-A947-70E740481C1C}">
                           <a14:useLocalDpi xmlns:a14="http://schemas.microsoft.com/office/drawing/2010/main" val="0"/>
@@ -1759,6 +1868,7 @@
           <w:sz w:val="20"/>
           <w:szCs w:val="20"/>
         </w:rPr>
+        <w:lastRenderedPageBreak/>
         <w:t>Y según este código hacemos su correspondiente clase para el test, FactorialTest.java</w:t>
       </w:r>
     </w:p>
@@ -1780,7 +1890,6 @@
           <w:szCs w:val="20"/>
           <w:lang w:eastAsia="es-ES"/>
         </w:rPr>
-        <w:lastRenderedPageBreak/>
         <w:drawing>
           <wp:inline distT="0" distB="0" distL="0" distR="0" wp14:anchorId="46F1EBBA" wp14:editId="1CE21854">
             <wp:extent cx="5400040" cy="6228715"/>
@@ -1797,7 +1906,7 @@
                     <pic:cNvPicPr/>
                   </pic:nvPicPr>
                   <pic:blipFill>
-                    <a:blip r:embed="rId15">
+                    <a:blip r:embed="rId16">
                       <a:extLst>
                         <a:ext uri="{28A0092B-C50C-407E-A947-70E740481C1C}">
                           <a14:useLocalDpi xmlns:a14="http://schemas.microsoft.com/office/drawing/2010/main" val="0"/>
@@ -2116,6 +2225,76 @@
     </w:p>
     <w:p>
       <w:pPr>
+        <w:pStyle w:val="Prrafodelista"/>
+        <w:rPr>
+          <w:rFonts w:ascii="Verdana" w:hAnsi="Verdana"/>
+          <w:sz w:val="20"/>
+          <w:szCs w:val="20"/>
+        </w:rPr>
+      </w:pPr>
+      <w:r>
+        <w:rPr>
+          <w:rFonts w:ascii="Verdana" w:hAnsi="Verdana"/>
+          <w:noProof/>
+          <w:sz w:val="20"/>
+          <w:szCs w:val="20"/>
+        </w:rPr>
+        <w:lastRenderedPageBreak/>
+        <w:drawing>
+          <wp:inline distT="0" distB="0" distL="0" distR="0" wp14:anchorId="59368CED" wp14:editId="1A97FC39">
+            <wp:extent cx="5400040" cy="1596390"/>
+            <wp:effectExtent l="0" t="0" r="0" b="3810"/>
+            <wp:docPr id="1974806490" name="Imagen 2"/>
+            <wp:cNvGraphicFramePr>
+              <a:graphicFrameLocks xmlns:a="http://schemas.openxmlformats.org/drawingml/2006/main" noChangeAspect="1"/>
+            </wp:cNvGraphicFramePr>
+            <a:graphic xmlns:a="http://schemas.openxmlformats.org/drawingml/2006/main">
+              <a:graphicData uri="http://schemas.openxmlformats.org/drawingml/2006/picture">
+                <pic:pic xmlns:pic="http://schemas.openxmlformats.org/drawingml/2006/picture">
+                  <pic:nvPicPr>
+                    <pic:cNvPr id="1974806490" name=""/>
+                    <pic:cNvPicPr/>
+                  </pic:nvPicPr>
+                  <pic:blipFill>
+                    <a:blip r:embed="rId17">
+                      <a:extLst>
+                        <a:ext uri="{28A0092B-C50C-407E-A947-70E740481C1C}">
+                          <a14:useLocalDpi xmlns:a14="http://schemas.microsoft.com/office/drawing/2010/main" val="0"/>
+                        </a:ext>
+                      </a:extLst>
+                    </a:blip>
+                    <a:stretch>
+                      <a:fillRect/>
+                    </a:stretch>
+                  </pic:blipFill>
+                  <pic:spPr>
+                    <a:xfrm>
+                      <a:off x="0" y="0"/>
+                      <a:ext cx="5400040" cy="1596390"/>
+                    </a:xfrm>
+                    <a:prstGeom prst="rect">
+                      <a:avLst/>
+                    </a:prstGeom>
+                  </pic:spPr>
+                </pic:pic>
+              </a:graphicData>
+            </a:graphic>
+          </wp:inline>
+        </w:drawing>
+      </w:r>
+    </w:p>
+    <w:p>
+      <w:pPr>
+        <w:pStyle w:val="Prrafodelista"/>
+        <w:rPr>
+          <w:rFonts w:ascii="Verdana" w:hAnsi="Verdana"/>
+          <w:sz w:val="20"/>
+          <w:szCs w:val="20"/>
+        </w:rPr>
+      </w:pPr>
+    </w:p>
+    <w:p>
+      <w:pPr>
         <w:spacing w:after="0" w:line="240" w:lineRule="auto"/>
         <w:rPr>
           <w:rFonts w:ascii="Verdana" w:hAnsi="Verdana"/>
@@ -2193,7 +2372,7 @@
                     <pic:cNvPicPr/>
                   </pic:nvPicPr>
                   <pic:blipFill>
-                    <a:blip r:embed="rId16">
+                    <a:blip r:embed="rId18">
                       <a:extLst>
                         <a:ext uri="{28A0092B-C50C-407E-A947-70E740481C1C}">
                           <a14:useLocalDpi xmlns:a14="http://schemas.microsoft.com/office/drawing/2010/main" val="0"/>
@@ -2235,7 +2414,25 @@
           <w:sz w:val="20"/>
           <w:szCs w:val="20"/>
         </w:rPr>
-        <w:t>Este es el código y este seria la clase test TablaEnterosTest.java</w:t>
+        <w:t xml:space="preserve">Este es el código y este </w:t>
+      </w:r>
+      <w:proofErr w:type="spellStart"/>
+      <w:r>
+        <w:rPr>
+          <w:rFonts w:ascii="Verdana" w:hAnsi="Verdana"/>
+          <w:sz w:val="20"/>
+          <w:szCs w:val="20"/>
+        </w:rPr>
+        <w:t>seria</w:t>
+      </w:r>
+      <w:proofErr w:type="spellEnd"/>
+      <w:r>
+        <w:rPr>
+          <w:rFonts w:ascii="Verdana" w:hAnsi="Verdana"/>
+          <w:sz w:val="20"/>
+          <w:szCs w:val="20"/>
+        </w:rPr>
+        <w:t xml:space="preserve"> la clase test TablaEnterosTest.java</w:t>
       </w:r>
     </w:p>
     <w:p>
@@ -2271,7 +2468,7 @@
                     <pic:cNvPicPr/>
                   </pic:nvPicPr>
                   <pic:blipFill>
-                    <a:blip r:embed="rId17">
+                    <a:blip r:embed="rId19">
                       <a:extLst>
                         <a:ext uri="{28A0092B-C50C-407E-A947-70E740481C1C}">
                           <a14:useLocalDpi xmlns:a14="http://schemas.microsoft.com/office/drawing/2010/main" val="0"/>
@@ -2321,7 +2518,7 @@
                     <pic:cNvPicPr/>
                   </pic:nvPicPr>
                   <pic:blipFill>
-                    <a:blip r:embed="rId18">
+                    <a:blip r:embed="rId20">
                       <a:extLst>
                         <a:ext uri="{28A0092B-C50C-407E-A947-70E740481C1C}">
                           <a14:useLocalDpi xmlns:a14="http://schemas.microsoft.com/office/drawing/2010/main" val="0"/>
@@ -2371,7 +2568,7 @@
                     <pic:cNvPicPr/>
                   </pic:nvPicPr>
                   <pic:blipFill>
-                    <a:blip r:embed="rId19">
+                    <a:blip r:embed="rId21">
                       <a:extLst>
                         <a:ext uri="{28A0092B-C50C-407E-A947-70E740481C1C}">
                           <a14:useLocalDpi xmlns:a14="http://schemas.microsoft.com/office/drawing/2010/main" val="0"/>
@@ -3161,6 +3358,56 @@
           <w:szCs w:val="20"/>
         </w:rPr>
       </w:pPr>
+      <w:r>
+        <w:rPr>
+          <w:rFonts w:ascii="Verdana" w:hAnsi="Verdana"/>
+          <w:noProof/>
+          <w:sz w:val="20"/>
+          <w:szCs w:val="20"/>
+        </w:rPr>
+        <w:lastRenderedPageBreak/>
+        <w:drawing>
+          <wp:inline distT="0" distB="0" distL="0" distR="0" wp14:anchorId="252859AD" wp14:editId="786831F9">
+            <wp:extent cx="5400040" cy="3529965"/>
+            <wp:effectExtent l="0" t="0" r="0" b="0"/>
+            <wp:docPr id="744614017" name="Imagen 3"/>
+            <wp:cNvGraphicFramePr>
+              <a:graphicFrameLocks xmlns:a="http://schemas.openxmlformats.org/drawingml/2006/main" noChangeAspect="1"/>
+            </wp:cNvGraphicFramePr>
+            <a:graphic xmlns:a="http://schemas.openxmlformats.org/drawingml/2006/main">
+              <a:graphicData uri="http://schemas.openxmlformats.org/drawingml/2006/picture">
+                <pic:pic xmlns:pic="http://schemas.openxmlformats.org/drawingml/2006/picture">
+                  <pic:nvPicPr>
+                    <pic:cNvPr id="744614017" name=""/>
+                    <pic:cNvPicPr/>
+                  </pic:nvPicPr>
+                  <pic:blipFill>
+                    <a:blip r:embed="rId22">
+                      <a:extLst>
+                        <a:ext uri="{28A0092B-C50C-407E-A947-70E740481C1C}">
+                          <a14:useLocalDpi xmlns:a14="http://schemas.microsoft.com/office/drawing/2010/main" val="0"/>
+                        </a:ext>
+                      </a:extLst>
+                    </a:blip>
+                    <a:stretch>
+                      <a:fillRect/>
+                    </a:stretch>
+                  </pic:blipFill>
+                  <pic:spPr>
+                    <a:xfrm>
+                      <a:off x="0" y="0"/>
+                      <a:ext cx="5400040" cy="3529965"/>
+                    </a:xfrm>
+                    <a:prstGeom prst="rect">
+                      <a:avLst/>
+                    </a:prstGeom>
+                  </pic:spPr>
+                </pic:pic>
+              </a:graphicData>
+            </a:graphic>
+          </wp:inline>
+        </w:drawing>
+      </w:r>
     </w:p>
     <w:p>
       <w:pPr>
@@ -3172,13 +3419,23 @@
         </w:rPr>
       </w:pPr>
     </w:p>
+    <w:p>
+      <w:pPr>
+        <w:spacing w:after="0" w:line="240" w:lineRule="auto"/>
+        <w:rPr>
+          <w:rFonts w:ascii="Verdana" w:hAnsi="Verdana"/>
+          <w:sz w:val="20"/>
+          <w:szCs w:val="20"/>
+        </w:rPr>
+      </w:pPr>
+    </w:p>
     <w:sectPr>
-      <w:headerReference w:type="even" r:id="rId20"/>
-      <w:headerReference w:type="default" r:id="rId21"/>
-      <w:footerReference w:type="even" r:id="rId22"/>
-      <w:footerReference w:type="default" r:id="rId23"/>
-      <w:headerReference w:type="first" r:id="rId24"/>
-      <w:footerReference w:type="first" r:id="rId25"/>
+      <w:headerReference w:type="even" r:id="rId23"/>
+      <w:headerReference w:type="default" r:id="rId24"/>
+      <w:footerReference w:type="even" r:id="rId25"/>
+      <w:footerReference w:type="default" r:id="rId26"/>
+      <w:headerReference w:type="first" r:id="rId27"/>
+      <w:footerReference w:type="first" r:id="rId28"/>
       <w:pgSz w:w="11906" w:h="16838"/>
       <w:pgMar w:top="1417" w:right="1701" w:bottom="1417" w:left="1701" w:header="708" w:footer="708" w:gutter="0"/>
       <w:cols w:space="708"/>
@@ -5071,6 +5328,7 @@
   <w:style w:type="character" w:default="1" w:styleId="Fuentedeprrafopredeter">
     <w:name w:val="Default Paragraph Font"/>
     <w:uiPriority w:val="1"/>
+    <w:semiHidden/>
     <w:unhideWhenUsed/>
   </w:style>
   <w:style w:type="table" w:default="1" w:styleId="Tablanormal">
@@ -5554,25 +5812,6 @@
 </file>
 
 <file path=customXml/item1.xml><?xml version="1.0" encoding="utf-8"?>
-<?mso-contentType ?>
-<FormTemplates xmlns="http://schemas.microsoft.com/sharepoint/v3/contenttype/forms">
-  <Display>DocumentLibraryForm</Display>
-  <Edit>DocumentLibraryForm</Edit>
-  <New>DocumentLibraryForm</New>
-</FormTemplates>
-</file>
-
-<file path=customXml/item2.xml><?xml version="1.0" encoding="utf-8"?>
-<p:properties xmlns:p="http://schemas.microsoft.com/office/2006/metadata/properties" xmlns:xsi="http://www.w3.org/2001/XMLSchema-instance" xmlns:pc="http://schemas.microsoft.com/office/infopath/2007/PartnerControls">
-  <documentManagement/>
-</p:properties>
-</file>
-
-<file path=customXml/item3.xml><?xml version="1.0" encoding="utf-8"?>
-<b:Sources xmlns:b="http://schemas.openxmlformats.org/officeDocument/2006/bibliography" xmlns="http://schemas.openxmlformats.org/officeDocument/2006/bibliography" SelectedStyle="\APASixthEditionOfficeOnline.xsl" StyleName="APA" Version="6"/>
-</file>
-
-<file path=customXml/item4.xml><?xml version="1.0" encoding="utf-8"?>
 <ct:contentTypeSchema xmlns:ct="http://schemas.microsoft.com/office/2006/metadata/contentType" xmlns:ma="http://schemas.microsoft.com/office/2006/metadata/properties/metaAttributes" ct:_="" ma:_="" ma:contentTypeName="Documento" ma:contentTypeID="0x010100E6EC6F4F51F0EA4C8C2D93155C66C017" ma:contentTypeVersion="9" ma:contentTypeDescription="Crear nuevo documento." ma:contentTypeScope="" ma:versionID="941e57cb35bb3228e73f52ffaff64366">
   <xsd:schema xmlns:xsd="http://www.w3.org/2001/XMLSchema" xmlns:xs="http://www.w3.org/2001/XMLSchema" xmlns:p="http://schemas.microsoft.com/office/2006/metadata/properties" xmlns:ns3="918234d9-d9af-4a5d-b29b-d98d865060eb" targetNamespace="http://schemas.microsoft.com/office/2006/metadata/properties" ma:root="true" ma:fieldsID="77782c9b71ce621fe75cf0d9969afc4e" ns3:_="">
     <xsd:import namespace="918234d9-d9af-4a5d-b29b-d98d865060eb"/>
@@ -5748,32 +5987,26 @@
 </ct:contentTypeSchema>
 </file>
 
-<file path=customXml/itemProps1.xml><?xml version="1.0" encoding="utf-8"?>
-<ds:datastoreItem xmlns:ds="http://schemas.openxmlformats.org/officeDocument/2006/customXml" ds:itemID="{194EFA11-1A12-41EC-BE0D-681EDFDF084E}">
-  <ds:schemaRefs>
-    <ds:schemaRef ds:uri="http://schemas.microsoft.com/sharepoint/v3/contenttype/forms"/>
-  </ds:schemaRefs>
-</ds:datastoreItem>
+<file path=customXml/item2.xml><?xml version="1.0" encoding="utf-8"?>
+<?mso-contentType ?>
+<FormTemplates xmlns="http://schemas.microsoft.com/sharepoint/v3/contenttype/forms">
+  <Display>DocumentLibraryForm</Display>
+  <Edit>DocumentLibraryForm</Edit>
+  <New>DocumentLibraryForm</New>
+</FormTemplates>
 </file>
 
-<file path=customXml/itemProps2.xml><?xml version="1.0" encoding="utf-8"?>
-<ds:datastoreItem xmlns:ds="http://schemas.openxmlformats.org/officeDocument/2006/customXml" ds:itemID="{540D97D2-E12D-416C-8D6E-781E305DEE88}">
-  <ds:schemaRefs>
-    <ds:schemaRef ds:uri="http://schemas.microsoft.com/office/2006/metadata/properties"/>
-    <ds:schemaRef ds:uri="http://schemas.microsoft.com/office/infopath/2007/PartnerControls"/>
-  </ds:schemaRefs>
-</ds:datastoreItem>
+<file path=customXml/item3.xml><?xml version="1.0" encoding="utf-8"?>
+<p:properties xmlns:p="http://schemas.microsoft.com/office/2006/metadata/properties" xmlns:xsi="http://www.w3.org/2001/XMLSchema-instance" xmlns:pc="http://schemas.microsoft.com/office/infopath/2007/PartnerControls">
+  <documentManagement/>
+</p:properties>
 </file>
 
-<file path=customXml/itemProps3.xml><?xml version="1.0" encoding="utf-8"?>
-<ds:datastoreItem xmlns:ds="http://schemas.openxmlformats.org/officeDocument/2006/customXml" ds:itemID="{3ED9E0E3-A3E9-49DC-AA84-B666240F8E46}">
-  <ds:schemaRefs>
-    <ds:schemaRef ds:uri="http://schemas.openxmlformats.org/officeDocument/2006/bibliography"/>
-  </ds:schemaRefs>
-</ds:datastoreItem>
+<file path=customXml/item4.xml><?xml version="1.0" encoding="utf-8"?>
+<b:Sources xmlns:b="http://schemas.openxmlformats.org/officeDocument/2006/bibliography" xmlns="http://schemas.openxmlformats.org/officeDocument/2006/bibliography" SelectedStyle="\APASixthEditionOfficeOnline.xsl" StyleName="APA" Version="6"/>
 </file>
 
-<file path=customXml/itemProps4.xml><?xml version="1.0" encoding="utf-8"?>
+<file path=customXml/itemProps1.xml><?xml version="1.0" encoding="utf-8"?>
 <ds:datastoreItem xmlns:ds="http://schemas.openxmlformats.org/officeDocument/2006/customXml" ds:itemID="{A5547CB3-3096-4D74-B425-6B0482CFA62B}">
   <ds:schemaRefs>
     <ds:schemaRef ds:uri="http://schemas.microsoft.com/office/2006/metadata/contentType"/>
@@ -5789,4 +6022,29 @@
     <ds:schemaRef ds:uri="http://schemas.microsoft.com/internal/obd"/>
   </ds:schemaRefs>
 </ds:datastoreItem>
+</file>
+
+<file path=customXml/itemProps2.xml><?xml version="1.0" encoding="utf-8"?>
+<ds:datastoreItem xmlns:ds="http://schemas.openxmlformats.org/officeDocument/2006/customXml" ds:itemID="{194EFA11-1A12-41EC-BE0D-681EDFDF084E}">
+  <ds:schemaRefs>
+    <ds:schemaRef ds:uri="http://schemas.microsoft.com/sharepoint/v3/contenttype/forms"/>
+  </ds:schemaRefs>
+</ds:datastoreItem>
+</file>
+
+<file path=customXml/itemProps3.xml><?xml version="1.0" encoding="utf-8"?>
+<ds:datastoreItem xmlns:ds="http://schemas.openxmlformats.org/officeDocument/2006/customXml" ds:itemID="{540D97D2-E12D-416C-8D6E-781E305DEE88}">
+  <ds:schemaRefs>
+    <ds:schemaRef ds:uri="http://schemas.microsoft.com/office/2006/metadata/properties"/>
+    <ds:schemaRef ds:uri="http://schemas.microsoft.com/office/infopath/2007/PartnerControls"/>
+  </ds:schemaRefs>
+</ds:datastoreItem>
+</file>
+
+<file path=customXml/itemProps4.xml><?xml version="1.0" encoding="utf-8"?>
+<ds:datastoreItem xmlns:ds="http://schemas.openxmlformats.org/officeDocument/2006/customXml" ds:itemID="{3ED9E0E3-A3E9-49DC-AA84-B666240F8E46}">
+  <ds:schemaRefs>
+    <ds:schemaRef ds:uri="http://schemas.openxmlformats.org/officeDocument/2006/bibliography"/>
+  </ds:schemaRefs>
+</ds:datastoreItem>
 </file>
</xml_diff>